<commit_message>
docs: correct Digital Twin research to reflect existing TecnoPark IFC pipeline
The v3 research doc treated per-element BIM/IFC picking (click a building
element to see its info panel) as future 2-week work, but this already runs
in production for the TecnoPark tower and underground pipe network — sourced
from real IFC files, baked into GLB, enriched from a SQLite metadata DB.
Also aligned the chart-library recommendation with the Chart.js already used
by both apps instead of suggesting ECharts as primary.

Co-Authored-By: Claude Sonnet 5 <noreply@anthropic.com>
</commit_message>
<xml_diff>
--- a/Research_DigitalTwin/NGHIEN_CUU_DIGITAL_TWIN_v3.docx
+++ b/Research_DigitalTwin/NGHIEN_CUU_DIGITAL_TWIN_v3.docx
@@ -115,11 +115,7 @@
           </w:pPr>
           <w:r>
             <w:fldChar w:fldCharType="begin"/>
-          </w:r>
-          <w:r>
             <w:instrText>TOC \h \o "1-2"</w:instrText>
-          </w:r>
-          <w:r>
             <w:fldChar w:fldCharType="separate"/>
           </w:r>
           <w:hyperlink w:anchor="_Toc235473756" w:history="1">
@@ -135,40 +131,10 @@
                 <w:noProof/>
               </w:rPr>
               <w:tab/>
-            </w:r>
-            <w:r>
-              <w:rPr>
-                <w:noProof/>
-              </w:rPr>
               <w:fldChar w:fldCharType="begin"/>
-            </w:r>
-            <w:r>
-              <w:rPr>
-                <w:noProof/>
-              </w:rPr>
               <w:instrText xml:space="preserve"> PAGEREF _Toc235473756 \h </w:instrText>
-            </w:r>
-            <w:r>
-              <w:rPr>
-                <w:noProof/>
-              </w:rPr>
-            </w:r>
-            <w:r>
-              <w:rPr>
-                <w:noProof/>
-              </w:rPr>
               <w:fldChar w:fldCharType="separate"/>
-            </w:r>
-            <w:r>
-              <w:rPr>
-                <w:noProof/>
-              </w:rPr>
               <w:t>2</w:t>
-            </w:r>
-            <w:r>
-              <w:rPr>
-                <w:noProof/>
-              </w:rPr>
               <w:fldChar w:fldCharType="end"/>
             </w:r>
           </w:hyperlink>
@@ -199,40 +165,10 @@
                 <w:noProof/>
               </w:rPr>
               <w:tab/>
-            </w:r>
-            <w:r>
-              <w:rPr>
-                <w:noProof/>
-              </w:rPr>
               <w:fldChar w:fldCharType="begin"/>
-            </w:r>
-            <w:r>
-              <w:rPr>
-                <w:noProof/>
-              </w:rPr>
               <w:instrText xml:space="preserve"> PAGEREF _Toc235473757 \h </w:instrText>
-            </w:r>
-            <w:r>
-              <w:rPr>
-                <w:noProof/>
-              </w:rPr>
-            </w:r>
-            <w:r>
-              <w:rPr>
-                <w:noProof/>
-              </w:rPr>
               <w:fldChar w:fldCharType="separate"/>
-            </w:r>
-            <w:r>
-              <w:rPr>
-                <w:noProof/>
-              </w:rPr>
               <w:t>4</w:t>
-            </w:r>
-            <w:r>
-              <w:rPr>
-                <w:noProof/>
-              </w:rPr>
               <w:fldChar w:fldCharType="end"/>
             </w:r>
           </w:hyperlink>
@@ -263,40 +199,10 @@
                 <w:noProof/>
               </w:rPr>
               <w:tab/>
-            </w:r>
-            <w:r>
-              <w:rPr>
-                <w:noProof/>
-              </w:rPr>
               <w:fldChar w:fldCharType="begin"/>
-            </w:r>
-            <w:r>
-              <w:rPr>
-                <w:noProof/>
-              </w:rPr>
               <w:instrText xml:space="preserve"> PAGEREF _Toc235473758 \h </w:instrText>
-            </w:r>
-            <w:r>
-              <w:rPr>
-                <w:noProof/>
-              </w:rPr>
-            </w:r>
-            <w:r>
-              <w:rPr>
-                <w:noProof/>
-              </w:rPr>
               <w:fldChar w:fldCharType="separate"/>
-            </w:r>
-            <w:r>
-              <w:rPr>
-                <w:noProof/>
-              </w:rPr>
               <w:t>4</w:t>
-            </w:r>
-            <w:r>
-              <w:rPr>
-                <w:noProof/>
-              </w:rPr>
               <w:fldChar w:fldCharType="end"/>
             </w:r>
           </w:hyperlink>
@@ -327,40 +233,10 @@
                 <w:noProof/>
               </w:rPr>
               <w:tab/>
-            </w:r>
-            <w:r>
-              <w:rPr>
-                <w:noProof/>
-              </w:rPr>
               <w:fldChar w:fldCharType="begin"/>
-            </w:r>
-            <w:r>
-              <w:rPr>
-                <w:noProof/>
-              </w:rPr>
               <w:instrText xml:space="preserve"> PAGEREF _Toc235473759 \h </w:instrText>
-            </w:r>
-            <w:r>
-              <w:rPr>
-                <w:noProof/>
-              </w:rPr>
-            </w:r>
-            <w:r>
-              <w:rPr>
-                <w:noProof/>
-              </w:rPr>
               <w:fldChar w:fldCharType="separate"/>
-            </w:r>
-            <w:r>
-              <w:rPr>
-                <w:noProof/>
-              </w:rPr>
               <w:t>4</w:t>
-            </w:r>
-            <w:r>
-              <w:rPr>
-                <w:noProof/>
-              </w:rPr>
               <w:fldChar w:fldCharType="end"/>
             </w:r>
           </w:hyperlink>
@@ -391,40 +267,10 @@
                 <w:noProof/>
               </w:rPr>
               <w:tab/>
-            </w:r>
-            <w:r>
-              <w:rPr>
-                <w:noProof/>
-              </w:rPr>
               <w:fldChar w:fldCharType="begin"/>
-            </w:r>
-            <w:r>
-              <w:rPr>
-                <w:noProof/>
-              </w:rPr>
               <w:instrText xml:space="preserve"> PAGEREF _Toc235473760 \h </w:instrText>
-            </w:r>
-            <w:r>
-              <w:rPr>
-                <w:noProof/>
-              </w:rPr>
-            </w:r>
-            <w:r>
-              <w:rPr>
-                <w:noProof/>
-              </w:rPr>
               <w:fldChar w:fldCharType="separate"/>
-            </w:r>
-            <w:r>
-              <w:rPr>
-                <w:noProof/>
-              </w:rPr>
               <w:t>4</w:t>
-            </w:r>
-            <w:r>
-              <w:rPr>
-                <w:noProof/>
-              </w:rPr>
               <w:fldChar w:fldCharType="end"/>
             </w:r>
           </w:hyperlink>
@@ -455,40 +301,10 @@
                 <w:noProof/>
               </w:rPr>
               <w:tab/>
-            </w:r>
-            <w:r>
-              <w:rPr>
-                <w:noProof/>
-              </w:rPr>
               <w:fldChar w:fldCharType="begin"/>
-            </w:r>
-            <w:r>
-              <w:rPr>
-                <w:noProof/>
-              </w:rPr>
               <w:instrText xml:space="preserve"> PAGEREF _Toc235473761 \h </w:instrText>
-            </w:r>
-            <w:r>
-              <w:rPr>
-                <w:noProof/>
-              </w:rPr>
-            </w:r>
-            <w:r>
-              <w:rPr>
-                <w:noProof/>
-              </w:rPr>
               <w:fldChar w:fldCharType="separate"/>
-            </w:r>
-            <w:r>
-              <w:rPr>
-                <w:noProof/>
-              </w:rPr>
               <w:t>6</w:t>
-            </w:r>
-            <w:r>
-              <w:rPr>
-                <w:noProof/>
-              </w:rPr>
               <w:fldChar w:fldCharType="end"/>
             </w:r>
           </w:hyperlink>
@@ -519,40 +335,10 @@
                 <w:noProof/>
               </w:rPr>
               <w:tab/>
-            </w:r>
-            <w:r>
-              <w:rPr>
-                <w:noProof/>
-              </w:rPr>
               <w:fldChar w:fldCharType="begin"/>
-            </w:r>
-            <w:r>
-              <w:rPr>
-                <w:noProof/>
-              </w:rPr>
               <w:instrText xml:space="preserve"> PAGEREF _Toc235473762 \h </w:instrText>
-            </w:r>
-            <w:r>
-              <w:rPr>
-                <w:noProof/>
-              </w:rPr>
-            </w:r>
-            <w:r>
-              <w:rPr>
-                <w:noProof/>
-              </w:rPr>
               <w:fldChar w:fldCharType="separate"/>
-            </w:r>
-            <w:r>
-              <w:rPr>
-                <w:noProof/>
-              </w:rPr>
               <w:t>6</w:t>
-            </w:r>
-            <w:r>
-              <w:rPr>
-                <w:noProof/>
-              </w:rPr>
               <w:fldChar w:fldCharType="end"/>
             </w:r>
           </w:hyperlink>
@@ -583,40 +369,10 @@
                 <w:noProof/>
               </w:rPr>
               <w:tab/>
-            </w:r>
-            <w:r>
-              <w:rPr>
-                <w:noProof/>
-              </w:rPr>
               <w:fldChar w:fldCharType="begin"/>
-            </w:r>
-            <w:r>
-              <w:rPr>
-                <w:noProof/>
-              </w:rPr>
               <w:instrText xml:space="preserve"> PAGEREF _Toc235473763 \h </w:instrText>
-            </w:r>
-            <w:r>
-              <w:rPr>
-                <w:noProof/>
-              </w:rPr>
-            </w:r>
-            <w:r>
-              <w:rPr>
-                <w:noProof/>
-              </w:rPr>
               <w:fldChar w:fldCharType="separate"/>
-            </w:r>
-            <w:r>
-              <w:rPr>
-                <w:noProof/>
-              </w:rPr>
               <w:t>6</w:t>
-            </w:r>
-            <w:r>
-              <w:rPr>
-                <w:noProof/>
-              </w:rPr>
               <w:fldChar w:fldCharType="end"/>
             </w:r>
           </w:hyperlink>
@@ -647,40 +403,10 @@
                 <w:noProof/>
               </w:rPr>
               <w:tab/>
-            </w:r>
-            <w:r>
-              <w:rPr>
-                <w:noProof/>
-              </w:rPr>
               <w:fldChar w:fldCharType="begin"/>
-            </w:r>
-            <w:r>
-              <w:rPr>
-                <w:noProof/>
-              </w:rPr>
               <w:instrText xml:space="preserve"> PAGEREF _Toc235473764 \h </w:instrText>
-            </w:r>
-            <w:r>
-              <w:rPr>
-                <w:noProof/>
-              </w:rPr>
-            </w:r>
-            <w:r>
-              <w:rPr>
-                <w:noProof/>
-              </w:rPr>
               <w:fldChar w:fldCharType="separate"/>
-            </w:r>
-            <w:r>
-              <w:rPr>
-                <w:noProof/>
-              </w:rPr>
               <w:t>6</w:t>
-            </w:r>
-            <w:r>
-              <w:rPr>
-                <w:noProof/>
-              </w:rPr>
               <w:fldChar w:fldCharType="end"/>
             </w:r>
           </w:hyperlink>
@@ -711,40 +437,10 @@
                 <w:noProof/>
               </w:rPr>
               <w:tab/>
-            </w:r>
-            <w:r>
-              <w:rPr>
-                <w:noProof/>
-              </w:rPr>
               <w:fldChar w:fldCharType="begin"/>
-            </w:r>
-            <w:r>
-              <w:rPr>
-                <w:noProof/>
-              </w:rPr>
               <w:instrText xml:space="preserve"> PAGEREF _Toc235473765 \h </w:instrText>
-            </w:r>
-            <w:r>
-              <w:rPr>
-                <w:noProof/>
-              </w:rPr>
-            </w:r>
-            <w:r>
-              <w:rPr>
-                <w:noProof/>
-              </w:rPr>
               <w:fldChar w:fldCharType="separate"/>
-            </w:r>
-            <w:r>
-              <w:rPr>
-                <w:noProof/>
-              </w:rPr>
               <w:t>6</w:t>
-            </w:r>
-            <w:r>
-              <w:rPr>
-                <w:noProof/>
-              </w:rPr>
               <w:fldChar w:fldCharType="end"/>
             </w:r>
           </w:hyperlink>
@@ -775,40 +471,10 @@
                 <w:noProof/>
               </w:rPr>
               <w:tab/>
-            </w:r>
-            <w:r>
-              <w:rPr>
-                <w:noProof/>
-              </w:rPr>
               <w:fldChar w:fldCharType="begin"/>
-            </w:r>
-            <w:r>
-              <w:rPr>
-                <w:noProof/>
-              </w:rPr>
               <w:instrText xml:space="preserve"> PAGEREF _Toc235473766 \h </w:instrText>
-            </w:r>
-            <w:r>
-              <w:rPr>
-                <w:noProof/>
-              </w:rPr>
-            </w:r>
-            <w:r>
-              <w:rPr>
-                <w:noProof/>
-              </w:rPr>
               <w:fldChar w:fldCharType="separate"/>
-            </w:r>
-            <w:r>
-              <w:rPr>
-                <w:noProof/>
-              </w:rPr>
               <w:t>6</w:t>
-            </w:r>
-            <w:r>
-              <w:rPr>
-                <w:noProof/>
-              </w:rPr>
               <w:fldChar w:fldCharType="end"/>
             </w:r>
           </w:hyperlink>
@@ -839,40 +505,10 @@
                 <w:noProof/>
               </w:rPr>
               <w:tab/>
-            </w:r>
-            <w:r>
-              <w:rPr>
-                <w:noProof/>
-              </w:rPr>
               <w:fldChar w:fldCharType="begin"/>
-            </w:r>
-            <w:r>
-              <w:rPr>
-                <w:noProof/>
-              </w:rPr>
               <w:instrText xml:space="preserve"> PAGEREF _Toc235473767 \h </w:instrText>
-            </w:r>
-            <w:r>
-              <w:rPr>
-                <w:noProof/>
-              </w:rPr>
-            </w:r>
-            <w:r>
-              <w:rPr>
-                <w:noProof/>
-              </w:rPr>
               <w:fldChar w:fldCharType="separate"/>
-            </w:r>
-            <w:r>
-              <w:rPr>
-                <w:noProof/>
-              </w:rPr>
               <w:t>6</w:t>
-            </w:r>
-            <w:r>
-              <w:rPr>
-                <w:noProof/>
-              </w:rPr>
               <w:fldChar w:fldCharType="end"/>
             </w:r>
           </w:hyperlink>
@@ -903,40 +539,10 @@
                 <w:noProof/>
               </w:rPr>
               <w:tab/>
-            </w:r>
-            <w:r>
-              <w:rPr>
-                <w:noProof/>
-              </w:rPr>
               <w:fldChar w:fldCharType="begin"/>
-            </w:r>
-            <w:r>
-              <w:rPr>
-                <w:noProof/>
-              </w:rPr>
               <w:instrText xml:space="preserve"> PAGEREF _Toc235473768 \h </w:instrText>
-            </w:r>
-            <w:r>
-              <w:rPr>
-                <w:noProof/>
-              </w:rPr>
-            </w:r>
-            <w:r>
-              <w:rPr>
-                <w:noProof/>
-              </w:rPr>
               <w:fldChar w:fldCharType="separate"/>
-            </w:r>
-            <w:r>
-              <w:rPr>
-                <w:noProof/>
-              </w:rPr>
               <w:t>8</w:t>
-            </w:r>
-            <w:r>
-              <w:rPr>
-                <w:noProof/>
-              </w:rPr>
               <w:fldChar w:fldCharType="end"/>
             </w:r>
           </w:hyperlink>
@@ -967,40 +573,10 @@
                 <w:noProof/>
               </w:rPr>
               <w:tab/>
-            </w:r>
-            <w:r>
-              <w:rPr>
-                <w:noProof/>
-              </w:rPr>
               <w:fldChar w:fldCharType="begin"/>
-            </w:r>
-            <w:r>
-              <w:rPr>
-                <w:noProof/>
-              </w:rPr>
               <w:instrText xml:space="preserve"> PAGEREF _Toc235473769 \h </w:instrText>
-            </w:r>
-            <w:r>
-              <w:rPr>
-                <w:noProof/>
-              </w:rPr>
-            </w:r>
-            <w:r>
-              <w:rPr>
-                <w:noProof/>
-              </w:rPr>
               <w:fldChar w:fldCharType="separate"/>
-            </w:r>
-            <w:r>
-              <w:rPr>
-                <w:noProof/>
-              </w:rPr>
               <w:t>8</w:t>
-            </w:r>
-            <w:r>
-              <w:rPr>
-                <w:noProof/>
-              </w:rPr>
               <w:fldChar w:fldCharType="end"/>
             </w:r>
           </w:hyperlink>
@@ -1031,40 +607,10 @@
                 <w:noProof/>
               </w:rPr>
               <w:tab/>
-            </w:r>
-            <w:r>
-              <w:rPr>
-                <w:noProof/>
-              </w:rPr>
               <w:fldChar w:fldCharType="begin"/>
-            </w:r>
-            <w:r>
-              <w:rPr>
-                <w:noProof/>
-              </w:rPr>
               <w:instrText xml:space="preserve"> PAGEREF _Toc235473770 \h </w:instrText>
-            </w:r>
-            <w:r>
-              <w:rPr>
-                <w:noProof/>
-              </w:rPr>
-            </w:r>
-            <w:r>
-              <w:rPr>
-                <w:noProof/>
-              </w:rPr>
               <w:fldChar w:fldCharType="separate"/>
-            </w:r>
-            <w:r>
-              <w:rPr>
-                <w:noProof/>
-              </w:rPr>
               <w:t>8</w:t>
-            </w:r>
-            <w:r>
-              <w:rPr>
-                <w:noProof/>
-              </w:rPr>
               <w:fldChar w:fldCharType="end"/>
             </w:r>
           </w:hyperlink>
@@ -1095,40 +641,10 @@
                 <w:noProof/>
               </w:rPr>
               <w:tab/>
-            </w:r>
-            <w:r>
-              <w:rPr>
-                <w:noProof/>
-              </w:rPr>
               <w:fldChar w:fldCharType="begin"/>
-            </w:r>
-            <w:r>
-              <w:rPr>
-                <w:noProof/>
-              </w:rPr>
               <w:instrText xml:space="preserve"> PAGEREF _Toc235473771 \h </w:instrText>
-            </w:r>
-            <w:r>
-              <w:rPr>
-                <w:noProof/>
-              </w:rPr>
-            </w:r>
-            <w:r>
-              <w:rPr>
-                <w:noProof/>
-              </w:rPr>
               <w:fldChar w:fldCharType="separate"/>
-            </w:r>
-            <w:r>
-              <w:rPr>
-                <w:noProof/>
-              </w:rPr>
               <w:t>8</w:t>
-            </w:r>
-            <w:r>
-              <w:rPr>
-                <w:noProof/>
-              </w:rPr>
               <w:fldChar w:fldCharType="end"/>
             </w:r>
           </w:hyperlink>
@@ -1159,40 +675,10 @@
                 <w:noProof/>
               </w:rPr>
               <w:tab/>
-            </w:r>
-            <w:r>
-              <w:rPr>
-                <w:noProof/>
-              </w:rPr>
               <w:fldChar w:fldCharType="begin"/>
-            </w:r>
-            <w:r>
-              <w:rPr>
-                <w:noProof/>
-              </w:rPr>
               <w:instrText xml:space="preserve"> PAGEREF _Toc235473772 \h </w:instrText>
-            </w:r>
-            <w:r>
-              <w:rPr>
-                <w:noProof/>
-              </w:rPr>
-            </w:r>
-            <w:r>
-              <w:rPr>
-                <w:noProof/>
-              </w:rPr>
               <w:fldChar w:fldCharType="separate"/>
-            </w:r>
-            <w:r>
-              <w:rPr>
-                <w:noProof/>
-              </w:rPr>
               <w:t>8</w:t>
-            </w:r>
-            <w:r>
-              <w:rPr>
-                <w:noProof/>
-              </w:rPr>
               <w:fldChar w:fldCharType="end"/>
             </w:r>
           </w:hyperlink>
@@ -1223,40 +709,10 @@
                 <w:noProof/>
               </w:rPr>
               <w:tab/>
-            </w:r>
-            <w:r>
-              <w:rPr>
-                <w:noProof/>
-              </w:rPr>
               <w:fldChar w:fldCharType="begin"/>
-            </w:r>
-            <w:r>
-              <w:rPr>
-                <w:noProof/>
-              </w:rPr>
               <w:instrText xml:space="preserve"> PAGEREF _Toc235473773 \h </w:instrText>
-            </w:r>
-            <w:r>
-              <w:rPr>
-                <w:noProof/>
-              </w:rPr>
-            </w:r>
-            <w:r>
-              <w:rPr>
-                <w:noProof/>
-              </w:rPr>
               <w:fldChar w:fldCharType="separate"/>
-            </w:r>
-            <w:r>
-              <w:rPr>
-                <w:noProof/>
-              </w:rPr>
               <w:t>9</w:t>
-            </w:r>
-            <w:r>
-              <w:rPr>
-                <w:noProof/>
-              </w:rPr>
               <w:fldChar w:fldCharType="end"/>
             </w:r>
           </w:hyperlink>
@@ -1287,40 +743,10 @@
                 <w:noProof/>
               </w:rPr>
               <w:tab/>
-            </w:r>
-            <w:r>
-              <w:rPr>
-                <w:noProof/>
-              </w:rPr>
               <w:fldChar w:fldCharType="begin"/>
-            </w:r>
-            <w:r>
-              <w:rPr>
-                <w:noProof/>
-              </w:rPr>
               <w:instrText xml:space="preserve"> PAGEREF _Toc235473774 \h </w:instrText>
-            </w:r>
-            <w:r>
-              <w:rPr>
-                <w:noProof/>
-              </w:rPr>
-            </w:r>
-            <w:r>
-              <w:rPr>
-                <w:noProof/>
-              </w:rPr>
               <w:fldChar w:fldCharType="separate"/>
-            </w:r>
-            <w:r>
-              <w:rPr>
-                <w:noProof/>
-              </w:rPr>
               <w:t>9</w:t>
-            </w:r>
-            <w:r>
-              <w:rPr>
-                <w:noProof/>
-              </w:rPr>
               <w:fldChar w:fldCharType="end"/>
             </w:r>
           </w:hyperlink>
@@ -1351,40 +777,10 @@
                 <w:noProof/>
               </w:rPr>
               <w:tab/>
-            </w:r>
-            <w:r>
-              <w:rPr>
-                <w:noProof/>
-              </w:rPr>
               <w:fldChar w:fldCharType="begin"/>
-            </w:r>
-            <w:r>
-              <w:rPr>
-                <w:noProof/>
-              </w:rPr>
               <w:instrText xml:space="preserve"> PAGEREF _Toc235473775 \h </w:instrText>
-            </w:r>
-            <w:r>
-              <w:rPr>
-                <w:noProof/>
-              </w:rPr>
-            </w:r>
-            <w:r>
-              <w:rPr>
-                <w:noProof/>
-              </w:rPr>
               <w:fldChar w:fldCharType="separate"/>
-            </w:r>
-            <w:r>
-              <w:rPr>
-                <w:noProof/>
-              </w:rPr>
               <w:t>10</w:t>
-            </w:r>
-            <w:r>
-              <w:rPr>
-                <w:noProof/>
-              </w:rPr>
               <w:fldChar w:fldCharType="end"/>
             </w:r>
           </w:hyperlink>
@@ -1415,40 +811,10 @@
                 <w:noProof/>
               </w:rPr>
               <w:tab/>
-            </w:r>
-            <w:r>
-              <w:rPr>
-                <w:noProof/>
-              </w:rPr>
               <w:fldChar w:fldCharType="begin"/>
-            </w:r>
-            <w:r>
-              <w:rPr>
-                <w:noProof/>
-              </w:rPr>
               <w:instrText xml:space="preserve"> PAGEREF _Toc235473776 \h </w:instrText>
-            </w:r>
-            <w:r>
-              <w:rPr>
-                <w:noProof/>
-              </w:rPr>
-            </w:r>
-            <w:r>
-              <w:rPr>
-                <w:noProof/>
-              </w:rPr>
               <w:fldChar w:fldCharType="separate"/>
-            </w:r>
-            <w:r>
-              <w:rPr>
-                <w:noProof/>
-              </w:rPr>
               <w:t>10</w:t>
-            </w:r>
-            <w:r>
-              <w:rPr>
-                <w:noProof/>
-              </w:rPr>
               <w:fldChar w:fldCharType="end"/>
             </w:r>
           </w:hyperlink>
@@ -1479,40 +845,10 @@
                 <w:noProof/>
               </w:rPr>
               <w:tab/>
-            </w:r>
-            <w:r>
-              <w:rPr>
-                <w:noProof/>
-              </w:rPr>
               <w:fldChar w:fldCharType="begin"/>
-            </w:r>
-            <w:r>
-              <w:rPr>
-                <w:noProof/>
-              </w:rPr>
               <w:instrText xml:space="preserve"> PAGEREF _Toc235473777 \h </w:instrText>
-            </w:r>
-            <w:r>
-              <w:rPr>
-                <w:noProof/>
-              </w:rPr>
-            </w:r>
-            <w:r>
-              <w:rPr>
-                <w:noProof/>
-              </w:rPr>
               <w:fldChar w:fldCharType="separate"/>
-            </w:r>
-            <w:r>
-              <w:rPr>
-                <w:noProof/>
-              </w:rPr>
               <w:t>10</w:t>
-            </w:r>
-            <w:r>
-              <w:rPr>
-                <w:noProof/>
-              </w:rPr>
               <w:fldChar w:fldCharType="end"/>
             </w:r>
           </w:hyperlink>
@@ -1543,40 +879,10 @@
                 <w:noProof/>
               </w:rPr>
               <w:tab/>
-            </w:r>
-            <w:r>
-              <w:rPr>
-                <w:noProof/>
-              </w:rPr>
               <w:fldChar w:fldCharType="begin"/>
-            </w:r>
-            <w:r>
-              <w:rPr>
-                <w:noProof/>
-              </w:rPr>
               <w:instrText xml:space="preserve"> PAGEREF _Toc235473778 \h </w:instrText>
-            </w:r>
-            <w:r>
-              <w:rPr>
-                <w:noProof/>
-              </w:rPr>
-            </w:r>
-            <w:r>
-              <w:rPr>
-                <w:noProof/>
-              </w:rPr>
               <w:fldChar w:fldCharType="separate"/>
-            </w:r>
-            <w:r>
-              <w:rPr>
-                <w:noProof/>
-              </w:rPr>
               <w:t>10</w:t>
-            </w:r>
-            <w:r>
-              <w:rPr>
-                <w:noProof/>
-              </w:rPr>
               <w:fldChar w:fldCharType="end"/>
             </w:r>
           </w:hyperlink>
@@ -1607,40 +913,10 @@
                 <w:noProof/>
               </w:rPr>
               <w:tab/>
-            </w:r>
-            <w:r>
-              <w:rPr>
-                <w:noProof/>
-              </w:rPr>
               <w:fldChar w:fldCharType="begin"/>
-            </w:r>
-            <w:r>
-              <w:rPr>
-                <w:noProof/>
-              </w:rPr>
               <w:instrText xml:space="preserve"> PAGEREF _Toc235473779 \h </w:instrText>
-            </w:r>
-            <w:r>
-              <w:rPr>
-                <w:noProof/>
-              </w:rPr>
-            </w:r>
-            <w:r>
-              <w:rPr>
-                <w:noProof/>
-              </w:rPr>
               <w:fldChar w:fldCharType="separate"/>
-            </w:r>
-            <w:r>
-              <w:rPr>
-                <w:noProof/>
-              </w:rPr>
               <w:t>12</w:t>
-            </w:r>
-            <w:r>
-              <w:rPr>
-                <w:noProof/>
-              </w:rPr>
               <w:fldChar w:fldCharType="end"/>
             </w:r>
           </w:hyperlink>
@@ -1671,40 +947,10 @@
                 <w:noProof/>
               </w:rPr>
               <w:tab/>
-            </w:r>
-            <w:r>
-              <w:rPr>
-                <w:noProof/>
-              </w:rPr>
               <w:fldChar w:fldCharType="begin"/>
-            </w:r>
-            <w:r>
-              <w:rPr>
-                <w:noProof/>
-              </w:rPr>
               <w:instrText xml:space="preserve"> PAGEREF _Toc235473780 \h </w:instrText>
-            </w:r>
-            <w:r>
-              <w:rPr>
-                <w:noProof/>
-              </w:rPr>
-            </w:r>
-            <w:r>
-              <w:rPr>
-                <w:noProof/>
-              </w:rPr>
               <w:fldChar w:fldCharType="separate"/>
-            </w:r>
-            <w:r>
-              <w:rPr>
-                <w:noProof/>
-              </w:rPr>
               <w:t>12</w:t>
-            </w:r>
-            <w:r>
-              <w:rPr>
-                <w:noProof/>
-              </w:rPr>
               <w:fldChar w:fldCharType="end"/>
             </w:r>
           </w:hyperlink>
@@ -1735,40 +981,10 @@
                 <w:noProof/>
               </w:rPr>
               <w:tab/>
-            </w:r>
-            <w:r>
-              <w:rPr>
-                <w:noProof/>
-              </w:rPr>
               <w:fldChar w:fldCharType="begin"/>
-            </w:r>
-            <w:r>
-              <w:rPr>
-                <w:noProof/>
-              </w:rPr>
               <w:instrText xml:space="preserve"> PAGEREF _Toc235473781 \h </w:instrText>
-            </w:r>
-            <w:r>
-              <w:rPr>
-                <w:noProof/>
-              </w:rPr>
-            </w:r>
-            <w:r>
-              <w:rPr>
-                <w:noProof/>
-              </w:rPr>
               <w:fldChar w:fldCharType="separate"/>
-            </w:r>
-            <w:r>
-              <w:rPr>
-                <w:noProof/>
-              </w:rPr>
               <w:t>12</w:t>
-            </w:r>
-            <w:r>
-              <w:rPr>
-                <w:noProof/>
-              </w:rPr>
               <w:fldChar w:fldCharType="end"/>
             </w:r>
           </w:hyperlink>
@@ -1799,40 +1015,10 @@
                 <w:noProof/>
               </w:rPr>
               <w:tab/>
-            </w:r>
-            <w:r>
-              <w:rPr>
-                <w:noProof/>
-              </w:rPr>
               <w:fldChar w:fldCharType="begin"/>
-            </w:r>
-            <w:r>
-              <w:rPr>
-                <w:noProof/>
-              </w:rPr>
               <w:instrText xml:space="preserve"> PAGEREF _Toc235473782 \h </w:instrText>
-            </w:r>
-            <w:r>
-              <w:rPr>
-                <w:noProof/>
-              </w:rPr>
-            </w:r>
-            <w:r>
-              <w:rPr>
-                <w:noProof/>
-              </w:rPr>
               <w:fldChar w:fldCharType="separate"/>
-            </w:r>
-            <w:r>
-              <w:rPr>
-                <w:noProof/>
-              </w:rPr>
               <w:t>14</w:t>
-            </w:r>
-            <w:r>
-              <w:rPr>
-                <w:noProof/>
-              </w:rPr>
               <w:fldChar w:fldCharType="end"/>
             </w:r>
           </w:hyperlink>
@@ -1863,40 +1049,10 @@
                 <w:noProof/>
               </w:rPr>
               <w:tab/>
-            </w:r>
-            <w:r>
-              <w:rPr>
-                <w:noProof/>
-              </w:rPr>
               <w:fldChar w:fldCharType="begin"/>
-            </w:r>
-            <w:r>
-              <w:rPr>
-                <w:noProof/>
-              </w:rPr>
               <w:instrText xml:space="preserve"> PAGEREF _Toc235473783 \h </w:instrText>
-            </w:r>
-            <w:r>
-              <w:rPr>
-                <w:noProof/>
-              </w:rPr>
-            </w:r>
-            <w:r>
-              <w:rPr>
-                <w:noProof/>
-              </w:rPr>
               <w:fldChar w:fldCharType="separate"/>
-            </w:r>
-            <w:r>
-              <w:rPr>
-                <w:noProof/>
-              </w:rPr>
               <w:t>15</w:t>
-            </w:r>
-            <w:r>
-              <w:rPr>
-                <w:noProof/>
-              </w:rPr>
               <w:fldChar w:fldCharType="end"/>
             </w:r>
           </w:hyperlink>
@@ -1927,40 +1083,10 @@
                 <w:noProof/>
               </w:rPr>
               <w:tab/>
-            </w:r>
-            <w:r>
-              <w:rPr>
-                <w:noProof/>
-              </w:rPr>
               <w:fldChar w:fldCharType="begin"/>
-            </w:r>
-            <w:r>
-              <w:rPr>
-                <w:noProof/>
-              </w:rPr>
               <w:instrText xml:space="preserve"> PAGEREF _Toc235473784 \h </w:instrText>
-            </w:r>
-            <w:r>
-              <w:rPr>
-                <w:noProof/>
-              </w:rPr>
-            </w:r>
-            <w:r>
-              <w:rPr>
-                <w:noProof/>
-              </w:rPr>
               <w:fldChar w:fldCharType="separate"/>
-            </w:r>
-            <w:r>
-              <w:rPr>
-                <w:noProof/>
-              </w:rPr>
               <w:t>15</w:t>
-            </w:r>
-            <w:r>
-              <w:rPr>
-                <w:noProof/>
-              </w:rPr>
               <w:fldChar w:fldCharType="end"/>
             </w:r>
           </w:hyperlink>
@@ -1991,40 +1117,10 @@
                 <w:noProof/>
               </w:rPr>
               <w:tab/>
-            </w:r>
-            <w:r>
-              <w:rPr>
-                <w:noProof/>
-              </w:rPr>
               <w:fldChar w:fldCharType="begin"/>
-            </w:r>
-            <w:r>
-              <w:rPr>
-                <w:noProof/>
-              </w:rPr>
               <w:instrText xml:space="preserve"> PAGEREF _Toc235473785 \h </w:instrText>
-            </w:r>
-            <w:r>
-              <w:rPr>
-                <w:noProof/>
-              </w:rPr>
-            </w:r>
-            <w:r>
-              <w:rPr>
-                <w:noProof/>
-              </w:rPr>
               <w:fldChar w:fldCharType="separate"/>
-            </w:r>
-            <w:r>
-              <w:rPr>
-                <w:noProof/>
-              </w:rPr>
               <w:t>16</w:t>
-            </w:r>
-            <w:r>
-              <w:rPr>
-                <w:noProof/>
-              </w:rPr>
               <w:fldChar w:fldCharType="end"/>
             </w:r>
           </w:hyperlink>
@@ -2055,40 +1151,10 @@
                 <w:noProof/>
               </w:rPr>
               <w:tab/>
-            </w:r>
-            <w:r>
-              <w:rPr>
-                <w:noProof/>
-              </w:rPr>
               <w:fldChar w:fldCharType="begin"/>
-            </w:r>
-            <w:r>
-              <w:rPr>
-                <w:noProof/>
-              </w:rPr>
               <w:instrText xml:space="preserve"> PAGEREF _Toc235473786 \h </w:instrText>
-            </w:r>
-            <w:r>
-              <w:rPr>
-                <w:noProof/>
-              </w:rPr>
-            </w:r>
-            <w:r>
-              <w:rPr>
-                <w:noProof/>
-              </w:rPr>
               <w:fldChar w:fldCharType="separate"/>
-            </w:r>
-            <w:r>
-              <w:rPr>
-                <w:noProof/>
-              </w:rPr>
               <w:t>17</w:t>
-            </w:r>
-            <w:r>
-              <w:rPr>
-                <w:noProof/>
-              </w:rPr>
               <w:fldChar w:fldCharType="end"/>
             </w:r>
           </w:hyperlink>
@@ -2119,40 +1185,10 @@
                 <w:noProof/>
               </w:rPr>
               <w:tab/>
-            </w:r>
-            <w:r>
-              <w:rPr>
-                <w:noProof/>
-              </w:rPr>
               <w:fldChar w:fldCharType="begin"/>
-            </w:r>
-            <w:r>
-              <w:rPr>
-                <w:noProof/>
-              </w:rPr>
               <w:instrText xml:space="preserve"> PAGEREF _Toc235473787 \h </w:instrText>
-            </w:r>
-            <w:r>
-              <w:rPr>
-                <w:noProof/>
-              </w:rPr>
-            </w:r>
-            <w:r>
-              <w:rPr>
-                <w:noProof/>
-              </w:rPr>
               <w:fldChar w:fldCharType="separate"/>
-            </w:r>
-            <w:r>
-              <w:rPr>
-                <w:noProof/>
-              </w:rPr>
               <w:t>18</w:t>
-            </w:r>
-            <w:r>
-              <w:rPr>
-                <w:noProof/>
-              </w:rPr>
               <w:fldChar w:fldCharType="end"/>
             </w:r>
           </w:hyperlink>
@@ -2183,40 +1219,10 @@
                 <w:noProof/>
               </w:rPr>
               <w:tab/>
-            </w:r>
-            <w:r>
-              <w:rPr>
-                <w:noProof/>
-              </w:rPr>
               <w:fldChar w:fldCharType="begin"/>
-            </w:r>
-            <w:r>
-              <w:rPr>
-                <w:noProof/>
-              </w:rPr>
               <w:instrText xml:space="preserve"> PAGEREF _Toc235473788 \h </w:instrText>
-            </w:r>
-            <w:r>
-              <w:rPr>
-                <w:noProof/>
-              </w:rPr>
-            </w:r>
-            <w:r>
-              <w:rPr>
-                <w:noProof/>
-              </w:rPr>
               <w:fldChar w:fldCharType="separate"/>
-            </w:r>
-            <w:r>
-              <w:rPr>
-                <w:noProof/>
-              </w:rPr>
               <w:t>18</w:t>
-            </w:r>
-            <w:r>
-              <w:rPr>
-                <w:noProof/>
-              </w:rPr>
               <w:fldChar w:fldCharType="end"/>
             </w:r>
           </w:hyperlink>
@@ -2247,40 +1253,10 @@
                 <w:noProof/>
               </w:rPr>
               <w:tab/>
-            </w:r>
-            <w:r>
-              <w:rPr>
-                <w:noProof/>
-              </w:rPr>
               <w:fldChar w:fldCharType="begin"/>
-            </w:r>
-            <w:r>
-              <w:rPr>
-                <w:noProof/>
-              </w:rPr>
               <w:instrText xml:space="preserve"> PAGEREF _Toc235473789 \h </w:instrText>
-            </w:r>
-            <w:r>
-              <w:rPr>
-                <w:noProof/>
-              </w:rPr>
-            </w:r>
-            <w:r>
-              <w:rPr>
-                <w:noProof/>
-              </w:rPr>
               <w:fldChar w:fldCharType="separate"/>
-            </w:r>
-            <w:r>
-              <w:rPr>
-                <w:noProof/>
-              </w:rPr>
               <w:t>18</w:t>
-            </w:r>
-            <w:r>
-              <w:rPr>
-                <w:noProof/>
-              </w:rPr>
               <w:fldChar w:fldCharType="end"/>
             </w:r>
           </w:hyperlink>
@@ -2311,40 +1287,10 @@
                 <w:noProof/>
               </w:rPr>
               <w:tab/>
-            </w:r>
-            <w:r>
-              <w:rPr>
-                <w:noProof/>
-              </w:rPr>
               <w:fldChar w:fldCharType="begin"/>
-            </w:r>
-            <w:r>
-              <w:rPr>
-                <w:noProof/>
-              </w:rPr>
               <w:instrText xml:space="preserve"> PAGEREF _Toc235473790 \h </w:instrText>
-            </w:r>
-            <w:r>
-              <w:rPr>
-                <w:noProof/>
-              </w:rPr>
-            </w:r>
-            <w:r>
-              <w:rPr>
-                <w:noProof/>
-              </w:rPr>
               <w:fldChar w:fldCharType="separate"/>
-            </w:r>
-            <w:r>
-              <w:rPr>
-                <w:noProof/>
-              </w:rPr>
               <w:t>19</w:t>
-            </w:r>
-            <w:r>
-              <w:rPr>
-                <w:noProof/>
-              </w:rPr>
               <w:fldChar w:fldCharType="end"/>
             </w:r>
           </w:hyperlink>
@@ -2375,40 +1321,10 @@
                 <w:noProof/>
               </w:rPr>
               <w:tab/>
-            </w:r>
-            <w:r>
-              <w:rPr>
-                <w:noProof/>
-              </w:rPr>
               <w:fldChar w:fldCharType="begin"/>
-            </w:r>
-            <w:r>
-              <w:rPr>
-                <w:noProof/>
-              </w:rPr>
               <w:instrText xml:space="preserve"> PAGEREF _Toc235473791 \h </w:instrText>
-            </w:r>
-            <w:r>
-              <w:rPr>
-                <w:noProof/>
-              </w:rPr>
-            </w:r>
-            <w:r>
-              <w:rPr>
-                <w:noProof/>
-              </w:rPr>
               <w:fldChar w:fldCharType="separate"/>
-            </w:r>
-            <w:r>
-              <w:rPr>
-                <w:noProof/>
-              </w:rPr>
               <w:t>19</w:t>
-            </w:r>
-            <w:r>
-              <w:rPr>
-                <w:noProof/>
-              </w:rPr>
               <w:fldChar w:fldCharType="end"/>
             </w:r>
           </w:hyperlink>
@@ -2439,40 +1355,10 @@
                 <w:noProof/>
               </w:rPr>
               <w:tab/>
-            </w:r>
-            <w:r>
-              <w:rPr>
-                <w:noProof/>
-              </w:rPr>
               <w:fldChar w:fldCharType="begin"/>
-            </w:r>
-            <w:r>
-              <w:rPr>
-                <w:noProof/>
-              </w:rPr>
               <w:instrText xml:space="preserve"> PAGEREF _Toc235473792 \h </w:instrText>
-            </w:r>
-            <w:r>
-              <w:rPr>
-                <w:noProof/>
-              </w:rPr>
-            </w:r>
-            <w:r>
-              <w:rPr>
-                <w:noProof/>
-              </w:rPr>
               <w:fldChar w:fldCharType="separate"/>
-            </w:r>
-            <w:r>
-              <w:rPr>
-                <w:noProof/>
-              </w:rPr>
               <w:t>19</w:t>
-            </w:r>
-            <w:r>
-              <w:rPr>
-                <w:noProof/>
-              </w:rPr>
               <w:fldChar w:fldCharType="end"/>
             </w:r>
           </w:hyperlink>
@@ -2503,40 +1389,10 @@
                 <w:noProof/>
               </w:rPr>
               <w:tab/>
-            </w:r>
-            <w:r>
-              <w:rPr>
-                <w:noProof/>
-              </w:rPr>
               <w:fldChar w:fldCharType="begin"/>
-            </w:r>
-            <w:r>
-              <w:rPr>
-                <w:noProof/>
-              </w:rPr>
               <w:instrText xml:space="preserve"> PAGEREF _Toc235473793 \h </w:instrText>
-            </w:r>
-            <w:r>
-              <w:rPr>
-                <w:noProof/>
-              </w:rPr>
-            </w:r>
-            <w:r>
-              <w:rPr>
-                <w:noProof/>
-              </w:rPr>
               <w:fldChar w:fldCharType="separate"/>
-            </w:r>
-            <w:r>
-              <w:rPr>
-                <w:noProof/>
-              </w:rPr>
               <w:t>20</w:t>
-            </w:r>
-            <w:r>
-              <w:rPr>
-                <w:noProof/>
-              </w:rPr>
               <w:fldChar w:fldCharType="end"/>
             </w:r>
           </w:hyperlink>
@@ -2567,40 +1423,10 @@
                 <w:noProof/>
               </w:rPr>
               <w:tab/>
-            </w:r>
-            <w:r>
-              <w:rPr>
-                <w:noProof/>
-              </w:rPr>
               <w:fldChar w:fldCharType="begin"/>
-            </w:r>
-            <w:r>
-              <w:rPr>
-                <w:noProof/>
-              </w:rPr>
               <w:instrText xml:space="preserve"> PAGEREF _Toc235473794 \h </w:instrText>
-            </w:r>
-            <w:r>
-              <w:rPr>
-                <w:noProof/>
-              </w:rPr>
-            </w:r>
-            <w:r>
-              <w:rPr>
-                <w:noProof/>
-              </w:rPr>
               <w:fldChar w:fldCharType="separate"/>
-            </w:r>
-            <w:r>
-              <w:rPr>
-                <w:noProof/>
-              </w:rPr>
               <w:t>20</w:t>
-            </w:r>
-            <w:r>
-              <w:rPr>
-                <w:noProof/>
-              </w:rPr>
               <w:fldChar w:fldCharType="end"/>
             </w:r>
           </w:hyperlink>
@@ -2631,40 +1457,10 @@
                 <w:noProof/>
               </w:rPr>
               <w:tab/>
-            </w:r>
-            <w:r>
-              <w:rPr>
-                <w:noProof/>
-              </w:rPr>
               <w:fldChar w:fldCharType="begin"/>
-            </w:r>
-            <w:r>
-              <w:rPr>
-                <w:noProof/>
-              </w:rPr>
               <w:instrText xml:space="preserve"> PAGEREF _Toc235473795 \h </w:instrText>
-            </w:r>
-            <w:r>
-              <w:rPr>
-                <w:noProof/>
-              </w:rPr>
-            </w:r>
-            <w:r>
-              <w:rPr>
-                <w:noProof/>
-              </w:rPr>
               <w:fldChar w:fldCharType="separate"/>
-            </w:r>
-            <w:r>
-              <w:rPr>
-                <w:noProof/>
-              </w:rPr>
               <w:t>20</w:t>
-            </w:r>
-            <w:r>
-              <w:rPr>
-                <w:noProof/>
-              </w:rPr>
               <w:fldChar w:fldCharType="end"/>
             </w:r>
           </w:hyperlink>
@@ -2695,40 +1491,10 @@
                 <w:noProof/>
               </w:rPr>
               <w:tab/>
-            </w:r>
-            <w:r>
-              <w:rPr>
-                <w:noProof/>
-              </w:rPr>
               <w:fldChar w:fldCharType="begin"/>
-            </w:r>
-            <w:r>
-              <w:rPr>
-                <w:noProof/>
-              </w:rPr>
               <w:instrText xml:space="preserve"> PAGEREF _Toc235473796 \h </w:instrText>
-            </w:r>
-            <w:r>
-              <w:rPr>
-                <w:noProof/>
-              </w:rPr>
-            </w:r>
-            <w:r>
-              <w:rPr>
-                <w:noProof/>
-              </w:rPr>
               <w:fldChar w:fldCharType="separate"/>
-            </w:r>
-            <w:r>
-              <w:rPr>
-                <w:noProof/>
-              </w:rPr>
               <w:t>21</w:t>
-            </w:r>
-            <w:r>
-              <w:rPr>
-                <w:noProof/>
-              </w:rPr>
               <w:fldChar w:fldCharType="end"/>
             </w:r>
           </w:hyperlink>
@@ -2804,15 +1570,7 @@
           <w:iCs/>
           <w:color w:val="555555"/>
         </w:rPr>
-        <w:t xml:space="preserve"> Các sản phẩm digital twin (bản sao số) tiêu biểu trên thế giới xây dựng bằng Unity, Unreal Engine, NVIDIA Omniverse và nền tảng web 3D; trọng tâm là digital twin đô thị </w:t>
-      </w:r>
-      <w:r>
-        <w:rPr>
-          <w:i/>
-          <w:iCs/>
-          <w:color w:val="555555"/>
-        </w:rPr>
-        <w:t>(smart city), campus và sân vận động.</w:t>
+        <w:t xml:space="preserve"> Các sản phẩm digital twin (bản sao số) tiêu biểu trên thế giới xây dựng bằng Unity, Unreal Engine, NVIDIA Omniverse và nền tảng web 3D; trọng tâm là digital twin đô thị (smart city), campus và sân vận động.</w:t>
       </w:r>
     </w:p>
     <w:p>
@@ -2863,19 +1621,10 @@
           <w:bCs/>
         </w:rPr>
         <w:t>1.</w:t>
-      </w:r>
-      <w:r>
-        <w:rPr>
-          <w:b/>
-          <w:bCs/>
-        </w:rPr>
         <w:tab/>
       </w:r>
       <w:r>
-        <w:t xml:space="preserve">Các dự án digital </w:t>
-      </w:r>
-      <w:r>
-        <w:t>twin đô thị/sân vận động tiêu biểu trên thế giới dùng công nghệ gì (engine, dữ liệu, kiến trúc)?</w:t>
+        <w:t xml:space="preserve">Các dự án digital twin đô thị/sân vận động tiêu biểu trên thế giới dùng công nghệ gì (engine, dữ liệu, kiến trúc)?</w:t>
       </w:r>
     </w:p>
     <w:p>
@@ -2889,12 +1638,6 @@
           <w:bCs/>
         </w:rPr>
         <w:t>2.</w:t>
-      </w:r>
-      <w:r>
-        <w:rPr>
-          <w:b/>
-          <w:bCs/>
-        </w:rPr>
         <w:tab/>
       </w:r>
       <w:r>
@@ -2912,19 +1655,10 @@
           <w:bCs/>
         </w:rPr>
         <w:t>3.</w:t>
-      </w:r>
-      <w:r>
-        <w:rPr>
-          <w:b/>
-          <w:bCs/>
-        </w:rPr>
         <w:tab/>
       </w:r>
       <w:r>
-        <w:t>Dự án hiện tại (pipeline Blender →</w:t>
-      </w:r>
-      <w:r>
-        <w:t xml:space="preserve"> GLB → web dashboard IOC) nên kế thừa gì, nâng cấp gì, và triển khai theo kế hoạch cụ thể nào trên điều kiện máy móc hiện có?</w:t>
+        <w:t xml:space="preserve">Dự án hiện tại (pipeline Blender → GLB → web dashboard IOC) nên kế thừa gì, nâng cấp gì, và triển khai theo kế hoạch cụ thể nào trên điều kiện máy móc hiện có?</w:t>
       </w:r>
     </w:p>
     <w:p>
@@ -3251,10 +1985,7 @@
               <w:spacing w:before="20" w:after="20"/>
             </w:pPr>
             <w:r>
-              <w:t>Áp dụng</w:t>
-            </w:r>
-            <w:r>
-              <w:t xml:space="preserve"> cho SVĐ Trống Đồng và PVF — cùng phương pháp, trình bày tóm lược</w:t>
+              <w:t xml:space="preserve">Áp dụng cho SVĐ Trống Đồng và PVF — cùng phương pháp, trình bày tóm lược</w:t>
             </w:r>
           </w:p>
         </w:tc>
@@ -3286,20 +2017,11 @@
           <w:bCs/>
         </w:rPr>
         <w:t>1.</w:t>
-      </w:r>
-      <w:r>
-        <w:rPr>
-          <w:b/>
-          <w:bCs/>
-        </w:rPr>
         <w:tab/>
         <w:t>Digital twin đô thị thành công không nằm ở đồ họa mà ở dữ liệu</w:t>
       </w:r>
       <w:r>
-        <w:t>: các dự án hàng đầu (Punggol Singapore, 51World Shanghai, SoFi Stadium) đều lấy tích</w:t>
-      </w:r>
-      <w:r>
-        <w:t xml:space="preserve"> hợp IoT/GIS/BIM thời gian thực làm lõi; engine 3D chỉ là lớp hiển thị.</w:t>
+        <w:t xml:space="preserve">: các dự án hàng đầu (Punggol Singapore, 51World Shanghai, SoFi Stadium) đều lấy tích hợp IoT/GIS/BIM thời gian thực làm lõi; engine 3D chỉ là lớp hiển thị.</w:t>
       </w:r>
     </w:p>
     <w:p>
@@ -3314,12 +2036,6 @@
         </w:rPr>
         <w:lastRenderedPageBreak/>
         <w:t>2.</w:t>
-      </w:r>
-      <w:r>
-        <w:rPr>
-          <w:b/>
-          <w:bCs/>
-        </w:rPr>
         <w:tab/>
         <w:t>Unity chiếm ưu thế ở khả năng đa nền tảng và WebGL</w:t>
       </w:r>
@@ -3358,12 +2074,6 @@
           <w:bCs/>
         </w:rPr>
         <w:t>3.</w:t>
-      </w:r>
-      <w:r>
-        <w:rPr>
-          <w:b/>
-          <w:bCs/>
-        </w:rPr>
         <w:tab/>
         <w:t>Chuẩn mở Cesium 3D Tiles (OGC)</w:t>
       </w:r>
@@ -3382,12 +2092,6 @@
           <w:bCs/>
         </w:rPr>
         <w:t>4.</w:t>
-      </w:r>
-      <w:r>
-        <w:rPr>
-          <w:b/>
-          <w:bCs/>
-        </w:rPr>
         <w:tab/>
         <w:t>Với dự án hiện tại</w:t>
       </w:r>
@@ -3402,10 +2106,7 @@
         <w:t>web-first</w:t>
       </w:r>
       <w:r>
-        <w:t>: gi</w:t>
-      </w:r>
-      <w:r>
-        <w:t>ữ pipeline Blender → GLB → three.js, chuẩn hóa dữ liệu, nối dữ liệu thật qua MQTT — hoàn toàn khả thi trên máy phát triển hiện có (ThinkPad E14, không GPU rời). Kế hoạch chi tiết ở Chương 5.</w:t>
+        <w:t>: giữ pipeline Blender → GLB → three.js, chuẩn hóa dữ liệu, nối dữ liệu thật qua MQTT — hoàn toàn khả thi trên máy phát triển hiện có (ThinkPad E14, không GPU rời). Kế hoạch chi tiết ở Chương 5.</w:t>
       </w:r>
     </w:p>
     <w:p>
@@ -3448,10 +2149,7 @@
         <w:t>Tổng quan:</w:t>
       </w:r>
       <w:r>
-        <w:t xml:space="preserve"> Khu đô thị thông minh đầu tiên của Singapore vận hành hoàn toàn bằng nền tảng số (JTC Open Digital Platform); twin thời gian thực giám sát tòa nhà, năng </w:t>
-      </w:r>
-      <w:r>
-        <w:t>lượng, giao thông nội khu.</w:t>
+        <w:t xml:space="preserve"> Khu đô thị thông minh đầu tiên của Singapore vận hành hoàn toàn bằng nền tảng số (JTC Open Digital Platform); twin thời gian thực giám sát tòa nhà, năng lượng, giao thông nội khu.</w:t>
       </w:r>
     </w:p>
     <w:p>
@@ -3520,10 +2218,7 @@
       </w:pPr>
       <w:bookmarkStart w:id="7" w:name="_Toc235473763"/>
       <w:r>
-        <w:t>2. O</w:t>
-      </w:r>
-      <w:r>
-        <w:t>rlando Regional Digital Twin — Mỹ (Unity)</w:t>
+        <w:t>2. Orlando Regional Digital Twin — Mỹ (Unity)</w:t>
       </w:r>
       <w:bookmarkEnd w:id="7"/>
     </w:p>
@@ -3574,10 +2269,7 @@
         <w:t>Bài học:</w:t>
       </w:r>
       <w:r>
-        <w:t xml:space="preserve"> Tw</w:t>
-      </w:r>
-      <w:r>
-        <w:t xml:space="preserve">in có giá trị </w:t>
+        <w:t xml:space="preserve"> Twin có giá trị </w:t>
       </w:r>
       <w:r>
         <w:rPr>
@@ -3627,10 +2319,7 @@
         <w:t>3.750 km²</w:t>
       </w:r>
       <w:r>
-        <w:t>): hơn 20 công trình biểu tượ</w:t>
-      </w:r>
-      <w:r>
-        <w:t xml:space="preserve">ng dựng thủ công, phần còn lại </w:t>
+        <w:t xml:space="preserve">): hơn 20 công trình biểu tượng dựng thủ công, phần còn lại </w:t>
       </w:r>
       <w:r>
         <w:rPr>
@@ -3680,10 +2369,7 @@
         <w:t>LOD phân tầng</w:t>
       </w:r>
       <w:r>
-        <w:t xml:space="preserve"> — chỉ dựng chi tiết công trình biểu tượng — quyết định tính khả thi chi phí; (b) </w:t>
-      </w:r>
-      <w:r>
-        <w:t xml:space="preserve">giá trị nằm ở </w:t>
+        <w:t xml:space="preserve"> — chỉ dựng chi tiết công trình biểu tượng — quyết định tính khả thi chi phí; (b) giá trị nằm ở </w:t>
       </w:r>
       <w:r>
         <w:rPr>
@@ -3733,10 +2419,7 @@
         <w:t>3.000 nhà ga</w:t>
       </w:r>
       <w:r>
-        <w:t>: giám sát vận hành thời gian thực, mô phỏng ứng cứu khẩn cấp, lập kế hoạch nâng cấp. NVIDIA đ</w:t>
-      </w:r>
-      <w:r>
-        <w:t>óng gói mô hình này thành Blueprint smart city (twin + AI camera + video analytics).</w:t>
+        <w:t>: giám sát vận hành thời gian thực, mô phỏng ứng cứu khẩn cấp, lập kế hoạch nâng cấp. NVIDIA đóng gói mô hình này thành Blueprint smart city (twin + AI camera + video analytics).</w:t>
       </w:r>
     </w:p>
     <w:p>
@@ -3765,10 +2448,7 @@
       </w:pPr>
       <w:bookmarkStart w:id="10" w:name="_Toc235473766"/>
       <w:r>
-        <w:t>5.</w:t>
-      </w:r>
-      <w:r>
-        <w:t xml:space="preserve"> Đặc điểm chung rút ra</w:t>
+        <w:t xml:space="preserve">5. Đặc điểm chung rút ra</w:t>
       </w:r>
       <w:bookmarkEnd w:id="10"/>
     </w:p>
@@ -3805,10 +2485,7 @@
         <w:spacing w:after="40"/>
       </w:pPr>
       <w:r>
-        <w:t>Các nghiên cứu học thuật (twin giao thông trên Unity, twin campus NYU Abu Dhabi, twin c</w:t>
-      </w:r>
-      <w:r>
-        <w:t xml:space="preserve">ông trường RWTH Aachen dùng MQTT) đều lặp lại pattern: </w:t>
+        <w:t xml:space="preserve">Các nghiên cứu học thuật (twin giao thông trên Unity, twin campus NYU Abu Dhabi, twin công trường RWTH Aachen dùng MQTT) đều lặp lại pattern: </w:t>
       </w:r>
       <w:r>
         <w:rPr>
@@ -3914,13 +2591,7 @@
           <w:rPr>
             <w:rStyle w:val="Hyperlink"/>
           </w:rPr>
-          <w:t>NVIDIA Blog — Omniverse Blueprin</w:t>
-        </w:r>
-        <w:r>
-          <w:rPr>
-            <w:rStyle w:val="Hyperlink"/>
-          </w:rPr>
-          <w:t>t for smart city AI (SNCF)</w:t>
+          <w:t>NVIDIA Blog — Omniverse Blueprint for smart city AI (SNCF)</w:t>
         </w:r>
       </w:hyperlink>
       <w:r>
@@ -3984,10 +2655,7 @@
       <w:bookmarkStart w:id="12" w:name="_Toc235473768"/>
       <w:r>
         <w:lastRenderedPageBreak/>
-        <w:t xml:space="preserve">Case study thế giới — Sân vận </w:t>
-      </w:r>
-      <w:r>
-        <w:t>động (tóm lược)</w:t>
+        <w:t xml:space="preserve">Case study thế giới — Sân vận động (tóm lược)</w:t>
       </w:r>
       <w:bookmarkEnd w:id="12"/>
     </w:p>
@@ -4048,10 +2716,7 @@
         <w:t>Giá trị đã ghi nhận:</w:t>
       </w:r>
       <w:r>
-        <w:t xml:space="preserve"> Bảo trì – vận hành (O&amp;M),</w:t>
-      </w:r>
-      <w:r>
-        <w:t xml:space="preserve"> tối ưu năng lượng; chỉ đường cho nhân viên mới ngày thi đấu; phân tích để </w:t>
+        <w:t xml:space="preserve"> Bảo trì – vận hành (O&amp;M), tối ưu năng lượng; chỉ đường cho nhân viên mới ngày thi đấu; phân tích để </w:t>
       </w:r>
       <w:r>
         <w:rPr>
@@ -4100,10 +2765,7 @@
       </w:pPr>
       <w:bookmarkStart w:id="14" w:name="_Toc235473770"/>
       <w:r>
-        <w:t>2. San</w:t>
-      </w:r>
-      <w:r>
-        <w:t>tiago Bernabéu (Real Madrid) — twin trải nghiệm &amp; doanh thu</w:t>
+        <w:t>2. Santiago Bernabéu (Real Madrid) — twin trải nghiệm &amp; doanh thu</w:t>
       </w:r>
       <w:bookmarkEnd w:id="14"/>
     </w:p>
@@ -4174,10 +2836,7 @@
         <w:t>Bài học:</w:t>
       </w:r>
       <w:r>
-        <w:t xml:space="preserve"> Twin sân vận độn</w:t>
-      </w:r>
-      <w:r>
-        <w:t xml:space="preserve">g có nhánh giá trị thứ hai: </w:t>
+        <w:t xml:space="preserve"> Twin sân vận động có nhánh giá trị thứ hai: </w:t>
       </w:r>
       <w:r>
         <w:rPr>
@@ -4205,10 +2864,7 @@
         <w:spacing w:after="80"/>
       </w:pPr>
       <w:r>
-        <w:t xml:space="preserve">Làn sóng "mỗi sân đăng cai cần một digital twin": mô phỏng luồng khán giả, </w:t>
-      </w:r>
-      <w:r>
-        <w:t>an ninh, sơ tán, logistics sự kiện lớn. Tổng hợp 5 nhóm giá trị:</w:t>
+        <w:t xml:space="preserve">Làn sóng "mỗi sân đăng cai cần một digital twin": mô phỏng luồng khán giả, an ninh, sơ tán, logistics sự kiện lớn. Tổng hợp 5 nhóm giá trị:</w:t>
       </w:r>
     </w:p>
     <w:tbl>
@@ -4639,10 +3295,7 @@
               <w:spacing w:before="20" w:after="20"/>
             </w:pPr>
             <w:r>
-              <w:t>Hướng mở cho P</w:t>
-            </w:r>
-            <w:r>
-              <w:t>VF</w:t>
+              <w:t>Hướng mở cho PVF</w:t>
             </w:r>
           </w:p>
         </w:tc>
@@ -4735,13 +3388,7 @@
           <w:rPr>
             <w:rStyle w:val="Hyperlink"/>
           </w:rPr>
-          <w:t>The Future 3D — FIFA 2026</w:t>
-        </w:r>
-        <w:r>
-          <w:rPr>
-            <w:rStyle w:val="Hyperlink"/>
-          </w:rPr>
-          <w:t xml:space="preserve"> Stadium Digital Twins</w:t>
+          <w:t xml:space="preserve">The Future 3D — FIFA 2026 Stadium Digital Twins</w:t>
         </w:r>
       </w:hyperlink>
       <w:r>
@@ -4909,15 +3556,7 @@
                 <w:bCs/>
                 <w:color w:val="FFFFFF"/>
               </w:rPr>
-              <w:t>NVIDIA Omniver</w:t>
-            </w:r>
-            <w:r>
-              <w:rPr>
-                <w:b/>
-                <w:bCs/>
-                <w:color w:val="FFFFFF"/>
-              </w:rPr>
-              <w:t>se</w:t>
+              <w:t>NVIDIA Omniverse</w:t>
             </w:r>
           </w:p>
         </w:tc>
@@ -5313,10 +3952,7 @@
               <w:spacing w:before="20" w:after="20"/>
             </w:pPr>
             <w:r>
-              <w:t xml:space="preserve">Ngôn ngữ / </w:t>
-            </w:r>
-            <w:r>
-              <w:t>tốc độ phát triển</w:t>
+              <w:t xml:space="preserve">Ngôn ngữ / tốc độ phát triển</w:t>
             </w:r>
           </w:p>
         </w:tc>
@@ -5929,10 +4565,7 @@
               <w:spacing w:before="20" w:after="20"/>
             </w:pPr>
             <w:r>
-              <w:t>Dashboard IOC truy</w:t>
-            </w:r>
-            <w:r>
-              <w:t xml:space="preserve"> cập rộng rãi, chi phí thấp</w:t>
+              <w:t xml:space="preserve">Dashboard IOC truy cập rộng rãi, chi phí thấp</w:t>
             </w:r>
           </w:p>
         </w:tc>
@@ -5964,12 +4597,6 @@
           <w:bCs/>
         </w:rPr>
         <w:t>1.</w:t>
-      </w:r>
-      <w:r>
-        <w:rPr>
-          <w:b/>
-          <w:bCs/>
-        </w:rPr>
         <w:tab/>
         <w:t>Client-side web rendering (three.js/CesiumJS/Unity WebGL)</w:t>
       </w:r>
@@ -6014,12 +4641,6 @@
           <w:bCs/>
         </w:rPr>
         <w:t>2.</w:t>
-      </w:r>
-      <w:r>
-        <w:rPr>
-          <w:b/>
-          <w:bCs/>
-        </w:rPr>
         <w:tab/>
         <w:t>Pixel Streaming (Unreal/Unity chạy trên server GPU, stream video về browser)</w:t>
       </w:r>
@@ -6037,10 +4658,7 @@
         <w:spacing w:after="40"/>
       </w:pPr>
       <w:r>
-        <w:t xml:space="preserve">✅ Chất lượng điện </w:t>
-      </w:r>
-      <w:r>
-        <w:t>ảnh trên mọi thiết bị; bảo mật model (không tải asset về client).</w:t>
+        <w:t xml:space="preserve">✅ Chất lượng điện ảnh trên mọi thiết bị; bảo mật model (không tải asset về client).</w:t>
       </w:r>
     </w:p>
     <w:p>
@@ -6067,20 +4685,11 @@
           <w:bCs/>
         </w:rPr>
         <w:t>3.</w:t>
-      </w:r>
-      <w:r>
-        <w:rPr>
-          <w:b/>
-          <w:bCs/>
-        </w:rPr>
         <w:tab/>
         <w:t>Native app (Unreal/Unity build desktop)</w:t>
       </w:r>
       <w:r>
-        <w:t xml:space="preserve"> — cho </w:t>
-      </w:r>
-      <w:r>
-        <w:t>phòng điều hành (control room) với màn hình lớn, một số máy cấu hình mạnh.</w:t>
+        <w:t xml:space="preserve"> — cho phòng điều hành (control room) với màn hình lớn, một số máy cấu hình mạnh.</w:t>
       </w:r>
     </w:p>
     <w:p>
@@ -6110,10 +4719,7 @@
         <w:t>OGC 3D Tiles (Cesium):</w:t>
       </w:r>
       <w:r>
-        <w:t xml:space="preserve"> chuẩn mở stream dữ liệu địa không gian lớn (photogrammetry, LiDAR, BIM/CAD); được hỗ trợ đồng thời bở</w:t>
-      </w:r>
-      <w:r>
-        <w:t>i CesiumJS, Unity, Unreal, Omniverse, deck.gl ⇒ đầu tư 1 lần, dùng mọi engine. Google Photorealistic 3D Tiles cung cấp sẵn mô hình 3D của 2.500+ thành phố.</w:t>
+        <w:t xml:space="preserve"> chuẩn mở stream dữ liệu địa không gian lớn (photogrammetry, LiDAR, BIM/CAD); được hỗ trợ đồng thời bởi CesiumJS, Unity, Unreal, Omniverse, deck.gl ⇒ đầu tư 1 lần, dùng mọi engine. Google Photorealistic 3D Tiles cung cấp sẵn mô hình 3D của 2.500+ thành phố.</w:t>
       </w:r>
     </w:p>
     <w:p>
@@ -6153,10 +4759,7 @@
         <w:t>OpenUSD:</w:t>
       </w:r>
       <w:r>
-        <w:t xml:space="preserve"> chuẩn scene t</w:t>
-      </w:r>
-      <w:r>
-        <w:t>ổng hợp của Omniverse, đang lớn dần thành chuẩn công nghiệp.</w:t>
+        <w:t xml:space="preserve"> chuẩn scene tổng hợp của Omniverse, đang lớn dần thành chuẩn công nghiệp.</w:t>
       </w:r>
     </w:p>
     <w:p>
@@ -6367,13 +4970,7 @@
           <w:rPr>
             <w:rStyle w:val="Hyperlink"/>
           </w:rPr>
-          <w:t>Program-Ace — Building d</w:t>
-        </w:r>
-        <w:r>
-          <w:rPr>
-            <w:rStyle w:val="Hyperlink"/>
-          </w:rPr>
-          <w:t>igital twins with Cesium, Unreal, Twinmotion</w:t>
+          <w:t>Program-Ace — Building digital twins with Cesium, Unreal, Twinmotion</w:t>
         </w:r>
       </w:hyperlink>
     </w:p>
@@ -6412,20 +5009,10 @@
           <w:b/>
           <w:bCs/>
         </w:rPr>
-        <w:t>xây dựng phiên bản web hiển thị toàn bộ khu đô thị Vi</w:t>
-      </w:r>
-      <w:r>
-        <w:rPr>
-          <w:b/>
-          <w:bCs/>
-        </w:rPr>
-        <w:t>nhomes Ocean Park dưới dạng mô hình 3D chất lượng cao, vận hành mượt mà trên cả máy tính văn phòng lẫn thiết bị di động, trong đó mô hình được định vị chính xác trên bản đồ địa lý thực</w:t>
-      </w:r>
-      <w:r>
-        <w:t>. Đây là hạng mục nền tảng và cần được hoàn thành trước; việc tích hợp d</w:t>
-      </w:r>
-      <w:r>
-        <w:t>ữ liệu cảm biến thời gian thực được thực hiện ở giai đoạn kế tiếp, khi nền tảng hiển thị 3D đã ổn định.</w:t>
+        <w:t>xây dựng phiên bản web hiển thị toàn bộ khu đô thị Vinhomes Ocean Park dưới dạng mô hình 3D chất lượng cao, vận hành mượt mà trên cả máy tính văn phòng lẫn thiết bị di động, trong đó mô hình được định vị chính xác trên bản đồ địa lý thực</w:t>
+      </w:r>
+      <w:r>
+        <w:t>. Đây là hạng mục nền tảng và cần được hoàn thành trước; việc tích hợp dữ liệu cảm biến thời gian thực được thực hiện ở giai đoạn kế tiếp, khi nền tảng hiển thị 3D đã ổn định.</w:t>
       </w:r>
     </w:p>
     <w:p>
@@ -6447,19 +5034,7 @@
           <w:bCs/>
         </w:rPr>
         <w:t>1.</w:t>
-      </w:r>
-      <w:r>
-        <w:rPr>
-          <w:b/>
-          <w:bCs/>
-        </w:rPr>
         <w:tab/>
-      </w:r>
-      <w:r>
-        <w:rPr>
-          <w:b/>
-          <w:bCs/>
-        </w:rPr>
         <w:t>Chuyển đổi mô hình Ocean Park lên nền tảng web</w:t>
       </w:r>
       <w:r>
@@ -6477,12 +5052,6 @@
           <w:bCs/>
         </w:rPr>
         <w:t>2.</w:t>
-      </w:r>
-      <w:r>
-        <w:rPr>
-          <w:b/>
-          <w:bCs/>
-        </w:rPr>
         <w:tab/>
         <w:t>Định vị địa lý (georeferencing)</w:t>
       </w:r>
@@ -6501,12 +5070,6 @@
           <w:bCs/>
         </w:rPr>
         <w:t>3.</w:t>
-      </w:r>
-      <w:r>
-        <w:rPr>
-          <w:b/>
-          <w:bCs/>
-        </w:rPr>
         <w:tab/>
         <w:t>Tích hợp dữ liệu thời gian thực</w:t>
       </w:r>
@@ -6529,10 +5092,7 @@
         <w:spacing w:after="80"/>
       </w:pPr>
       <w:r>
-        <w:t>Trước hết cần làm rõ đặc thù của bài toán: ứng dụng web khác căn bản so với phần mềm cài đặt — toàn bộ tài nguyên phải</w:t>
-      </w:r>
-      <w:r>
-        <w:t xml:space="preserve"> được </w:t>
+        <w:t xml:space="preserve">Trước hết cần làm rõ đặc thù của bài toán: ứng dụng web khác căn bản so với phần mềm cài đặt — toàn bộ tài nguyên phải được </w:t>
       </w:r>
       <w:r>
         <w:rPr>
@@ -6562,10 +5122,7 @@
         <w:t>đạt chất lượng hình ảnh bằng kỹ thuật tối ưu thay vì dựa vào cấu hình phần cứng</w:t>
       </w:r>
       <w:r>
-        <w:t>. Các kỹ thuật trìn</w:t>
-      </w:r>
-      <w:r>
-        <w:t>h bày dưới đây đều đã được chuẩn hóa trong ngành; trường hợp 51World đưa toàn bộ 3.750 km² của Thượng Hải vào digital twin là minh chứng cho tính khả thi của cách tiếp cận này.</w:t>
+        <w:t>. Các kỹ thuật trình bày dưới đây đều đã được chuẩn hóa trong ngành; trường hợp 51World đưa toàn bộ 3.750 km² của Thượng Hải vào digital twin là minh chứng cho tính khả thi của cách tiếp cận này.</w:t>
       </w:r>
     </w:p>
     <w:p>
@@ -6680,15 +5237,7 @@
                 <w:bCs/>
                 <w:color w:val="FFFFFF"/>
               </w:rPr>
-              <w:t>Áp dụng cụ thể cho Ocean Pa</w:t>
-            </w:r>
-            <w:r>
-              <w:rPr>
-                <w:b/>
-                <w:bCs/>
-                <w:color w:val="FFFFFF"/>
-              </w:rPr>
-              <w:t>rk</w:t>
+              <w:t>Áp dụng cụ thể cho Ocean Park</w:t>
             </w:r>
           </w:p>
         </w:tc>
@@ -6810,12 +5359,7 @@
               <w:spacing w:before="20" w:after="20"/>
             </w:pPr>
             <w:r>
-              <w:t>Một</w:t>
-            </w:r>
-            <w:r>
-              <w:t xml:space="preserve"> lưới hình học (mesh) duy nhất được tái sử dụng cho hàng nghìn bản thể chỉ khác nhau về vị trí — GPU </w:t>
-            </w:r>
-            <w:r>
+              <w:t xml:space="preserve">Một lưới hình học (mesh) duy nhất được tái sử dụng cho hàng nghìn bản thể chỉ khác nhau về vị trí — GPU </w:t>
               <w:lastRenderedPageBreak/>
               <w:t>thực hiện một lệnh vẽ duy nhất</w:t>
             </w:r>
@@ -6868,14 +5412,7 @@
                 <w:b/>
                 <w:bCs/>
               </w:rPr>
-              <w:t>3. Bake án</w:t>
-            </w:r>
-            <w:r>
-              <w:rPr>
-                <w:b/>
-                <w:bCs/>
-              </w:rPr>
-              <w:t>h sáng</w:t>
+              <w:t>3. Bake ánh sáng</w:t>
             </w:r>
           </w:p>
         </w:tc>
@@ -6913,10 +5450,7 @@
               <w:spacing w:before="20" w:after="20"/>
             </w:pPr>
             <w:r>
-              <w:t>Trình duyệt không phải thực hiện tính toán chiếu sáng — hạng mục tiêu tốn tài nguyên nhất — song chất lượng hình ảnh tương</w:t>
-            </w:r>
-            <w:r>
-              <w:t xml:space="preserve"> đương ảnh kết xuất tĩnh. Lựa chọn một điều kiện chiếu sáng chuẩn (nắng xiên buổi chiều) và bake toàn khu một lần</w:t>
+              <w:t xml:space="preserve">Trình duyệt không phải thực hiện tính toán chiếu sáng — hạng mục tiêu tốn tài nguyên nhất — song chất lượng hình ảnh tương đương ảnh kết xuất tĩnh. Lựa chọn một điều kiện chiếu sáng chuẩn (nắng xiên buổi chiều) và bake toàn khu một lần</w:t>
             </w:r>
           </w:p>
         </w:tc>
@@ -6985,10 +5519,7 @@
               <w:spacing w:before="20" w:after="20"/>
             </w:pPr>
             <w:r>
-              <w:t>Draco nén dữ liệu hình học (mức giảm điển</w:t>
-            </w:r>
-            <w:r>
-              <w:t xml:space="preserve"> hình 70–90%); KTX2 nén texture theo định dạng </w:t>
+              <w:t xml:space="preserve">Draco nén dữ liệu hình học (mức giảm điển hình 70–90%); KTX2 nén texture theo định dạng </w:t>
             </w:r>
             <w:r>
               <w:rPr>
@@ -7015,10 +5546,7 @@
         <w:spacing w:before="240" w:after="120"/>
       </w:pPr>
       <w:r>
-        <w:t xml:space="preserve">2.2. Phân mảnh không gian và tải theo </w:t>
-      </w:r>
-      <w:r>
-        <w:t>nhu cầu</w:t>
+        <w:t xml:space="preserve">2.2. Phân mảnh không gian và tải theo nhu cầu</w:t>
       </w:r>
     </w:p>
     <w:p>
@@ -7026,10 +5554,7 @@
         <w:spacing w:after="80"/>
       </w:pPr>
       <w:r>
-        <w:t>Khu đô thị được phân chia thành các phân khu (Technopark, VinUni, khu hồ, các phân khu nhà ở...), mỗi phân khu xuất thành một tệp GLB độc lập. Hệ thống chỉ tải phiên bản chi tiết của phân khu trong vùng quan sát hiện tại; các phân khu ở xa hiển thị ở mức c</w:t>
-      </w:r>
-      <w:r>
-        <w:t>hi tiết thấp và chỉ được tải đầy đủ khi camera tiếp cận (cơ chế progressive loading). Nhờ đó thời gian mở trang được giữ ở mức thấp dù tổng khối lượng mô hình lớn.</w:t>
+        <w:t>Khu đô thị được phân chia thành các phân khu (Technopark, VinUni, khu hồ, các phân khu nhà ở...), mỗi phân khu xuất thành một tệp GLB độc lập. Hệ thống chỉ tải phiên bản chi tiết của phân khu trong vùng quan sát hiện tại; các phân khu ở xa hiển thị ở mức chi tiết thấp và chỉ được tải đầy đủ khi camera tiếp cận (cơ chế progressive loading). Nhờ đó thời gian mở trang được giữ ở mức thấp dù tổng khối lượng mô hình lớn.</w:t>
       </w:r>
     </w:p>
     <w:p>
@@ -7046,10 +5571,7 @@
         <w:spacing w:after="80"/>
       </w:pPr>
       <w:r>
-        <w:t>Ba yếu tố sa</w:t>
-      </w:r>
-      <w:r>
-        <w:t>u quyết định phần lớn chất lượng hình ảnh cảm nhận được, đều chỉ cần thiết lập một lần và gần như không phát sinh chi phí hiệu năng:</w:t>
+        <w:t>Ba yếu tố sau quyết định phần lớn chất lượng hình ảnh cảm nhận được, đều chỉ cần thiết lập một lần và gần như không phát sinh chi phí hiệu năng:</w:t>
       </w:r>
     </w:p>
     <w:p>
@@ -7069,10 +5591,7 @@
         <w:t>Ảnh môi trường (HDRI):</w:t>
       </w:r>
       <w:r>
-        <w:t xml:space="preserve"> một ảnh toàn cảnh bầu trời dung lượng 1–2 MB đóng vai trò nguồn sáng tổng thể, tạo phản xạ tự nhiên </w:t>
-      </w:r>
-      <w:r>
-        <w:t>trên vật liệu mà không cần hệ thống đèn phức tạp.</w:t>
+        <w:t xml:space="preserve"> một ảnh toàn cảnh bầu trời dung lượng 1–2 MB đóng vai trò nguồn sáng tổng thể, tạo phản xạ tự nhiên trên vật liệu mà không cần hệ thống đèn phức tạp.</w:t>
       </w:r>
     </w:p>
     <w:p>
@@ -7112,10 +5631,7 @@
         <w:t>Bóng đổ đã bake</w:t>
       </w:r>
       <w:r>
-        <w:t xml:space="preserve"> (mục 2.1): các vùng tối tiếp xúc tại chân công trình và </w:t>
-      </w:r>
-      <w:r>
-        <w:t>tán cây tạo chiều sâu không gian.</w:t>
+        <w:t xml:space="preserve"> (mục 2.1): các vùng tối tiếp xúc tại chân công trình và tán cây tạo chiều sâu không gian.</w:t>
       </w:r>
     </w:p>
     <w:p>
@@ -7525,10 +6041,7 @@
         <w:t>thiết bị tham chiếu</w:t>
       </w:r>
       <w:r>
-        <w:t>: hiệu năng đạt yêu cầu trên cấu hình này bảo đảm phần lớn người dùng cuối có trải ng</w:t>
-      </w:r>
-      <w:r>
-        <w:t>hiệm tương đương hoặc tốt hơn.</w:t>
+        <w:t>: hiệu năng đạt yêu cầu trên cấu hình này bảo đảm phần lớn người dùng cuối có trải nghiệm tương đương hoặc tốt hơn.</w:t>
       </w:r>
     </w:p>
     <w:p>
@@ -7565,10 +6078,7 @@
         <w:t>neo một điểm tham chiếu</w:t>
       </w:r>
       <w:r>
-        <w:t>: lựa chọn một mốc thực địa tại Ocean Park (ví dụ cổng chào hoặc ch</w:t>
-      </w:r>
-      <w:r>
-        <w:t xml:space="preserve">ân tháp Technopark), xác định tọa độ GPS của mốc (có thể lấy trực tiếp từ Google Maps ở độ chính xác đủ dùng cho giai đoạn đầu), sau đó khai báo gốc tọa độ của mô hình trùng với tọa độ này. Hai điều kiện đi kèm: mô hình được dựng theo </w:t>
+        <w:t xml:space="preserve">: lựa chọn một mốc thực địa tại Ocean Park (ví dụ cổng chào hoặc chân tháp Technopark), xác định tọa độ GPS của mốc (có thể lấy trực tiếp từ Google Maps ở độ chính xác đủ dùng cho giai đoạn đầu), sau đó khai báo gốc tọa độ của mô hình trùng với tọa độ này. Hai điều kiện đi kèm: mô hình được dựng theo </w:t>
       </w:r>
       <w:r>
         <w:rPr>
@@ -7585,14 +6095,7 @@
           <w:b/>
           <w:bCs/>
         </w:rPr>
-        <w:t>đị</w:t>
-      </w:r>
-      <w:r>
-        <w:rPr>
-          <w:b/>
-          <w:bCs/>
-        </w:rPr>
-        <w:t>nh hướng đúng phương bắc</w:t>
+        <w:t>định hướng đúng phương bắc</w:t>
       </w:r>
       <w:r>
         <w:t>. Sau khi thiết lập, toàn bộ công trình tự động nằm đúng vị trí địa lý; phép neo chỉ cần thực hiện một lần và là cơ sở để mọi nguồn dữ liệu có tọa độ (GPS, cảm biến) về sau hiển thị chính xác.</w:t>
@@ -7603,10 +6106,7 @@
         <w:spacing w:after="80"/>
       </w:pPr>
       <w:r>
-        <w:t>Việc kiểm chứng độ khớp có thể thực hiệ</w:t>
-      </w:r>
-      <w:r>
-        <w:t>n trực quan: đối chiếu hệ thống đường giao thông trong mô hình với lớp đường trên bản đồ nền.</w:t>
+        <w:t>Việc kiểm chứng độ khớp có thể thực hiện trực quan: đối chiếu hệ thống đường giao thông trong mô hình với lớp đường trên bản đồ nền.</w:t>
       </w:r>
     </w:p>
     <w:p>
@@ -7774,32 +6274,26 @@
               <w:spacing w:before="20" w:after="20"/>
             </w:pPr>
             <w:r>
-              <w:t>Bản đồ web tiêu chuẩn là</w:t>
-            </w:r>
-            <w:r>
-              <w:t>m lớp nền; mô hình GLB được kết xuất chồng lên đúng tọa độ (MapLibre hỗ trợ sẵn cơ chế custom layer tích hợp three.js)</w:t>
-            </w:r>
-          </w:p>
-        </w:tc>
-        <w:tc>
-          <w:tcPr>
-            <w:tcW w:w="0" w:type="auto"/>
-            <w:tcMar>
-              <w:top w:w="60" w:type="dxa"/>
-              <w:left w:w="100" w:type="dxa"/>
-              <w:bottom w:w="60" w:type="dxa"/>
-              <w:right w:w="100" w:type="dxa"/>
-            </w:tcMar>
-          </w:tcPr>
-          <w:p>
-            <w:pPr>
-              <w:spacing w:before="20" w:after="20"/>
-            </w:pPr>
-            <w:r>
-              <w:t>Triển khai ngay: mã nguồn mở, chi phí bằng không, dung lượng thấp; đáp ứng nhu cầu hiển thị đường giao thông, mặt nước và bối cảnh xung q</w:t>
-            </w:r>
-            <w:r>
-              <w:t>uanh</w:t>
+              <w:t>Bản đồ web tiêu chuẩn làm lớp nền; mô hình GLB được kết xuất chồng lên đúng tọa độ (MapLibre hỗ trợ sẵn cơ chế custom layer tích hợp three.js)</w:t>
+            </w:r>
+          </w:p>
+        </w:tc>
+        <w:tc>
+          <w:tcPr>
+            <w:tcW w:w="0" w:type="auto"/>
+            <w:tcMar>
+              <w:top w:w="60" w:type="dxa"/>
+              <w:left w:w="100" w:type="dxa"/>
+              <w:bottom w:w="60" w:type="dxa"/>
+              <w:right w:w="100" w:type="dxa"/>
+            </w:tcMar>
+          </w:tcPr>
+          <w:p>
+            <w:pPr>
+              <w:spacing w:before="20" w:after="20"/>
+            </w:pPr>
+            <w:r>
+              <w:t>Triển khai ngay: mã nguồn mở, chi phí bằng không, dung lượng thấp; đáp ứng nhu cầu hiển thị đường giao thông, mặt nước và bối cảnh xung quanh</w:t>
             </w:r>
           </w:p>
         </w:tc>
@@ -7850,8 +6344,6 @@
             </w:pPr>
             <w:r>
               <w:t xml:space="preserve">Mô hình 3D thực tế của khu vực Hà Nội/Gia Lâm </w:t>
-            </w:r>
-            <w:r>
               <w:lastRenderedPageBreak/>
               <w:t>làm nền; hỗ trợ hiệu ứng camera tiếp cận từ tầm cao</w:t>
             </w:r>
@@ -7874,8 +6366,6 @@
             <w:r>
               <w:lastRenderedPageBreak/>
               <w:t xml:space="preserve">Giai đoạn nâng cấp, phục vụ trình diễn và xúc tiến đầu tư; yêu cầu API key và dung lượng truyền tải lớn </w:t>
-            </w:r>
-            <w:r>
               <w:lastRenderedPageBreak/>
               <w:t>hơn. Dữ liệu stream từ cloud nên không phát sinh yêu cầu phần cứng cục bộ</w:t>
             </w:r>
@@ -7893,10 +6383,7 @@
         <w:spacing w:after="80"/>
       </w:pPr>
       <w:r>
-        <w:t>Lộ trình khuyến nghị: triển khai phương án A làm nền tảng chính, bổ sung phư</w:t>
-      </w:r>
-      <w:r>
-        <w:t>ơng án B như một chế độ hiển thị riêng phục vụ trình diễn.</w:t>
+        <w:t>Lộ trình khuyến nghị: triển khai phương án A làm nền tảng chính, bổ sung phương án B như một chế độ hiển thị riêng phục vụ trình diễn.</w:t>
       </w:r>
     </w:p>
     <w:p>
@@ -7931,10 +6418,7 @@
         <w:spacing w:after="40"/>
       </w:pPr>
       <w:r>
-        <w:t>Chuẩn hóa tệp Blender: thống nhất đơn vị mét, trục địn</w:t>
-      </w:r>
-      <w:r>
-        <w:t>h hướng phương bắc, gốc scene đặt tại mốc tham chiếu.</w:t>
+        <w:t>Chuẩn hóa tệp Blender: thống nhất đơn vị mét, trục định hướng phương bắc, gốc scene đặt tại mốc tham chiếu.</w:t>
       </w:r>
     </w:p>
     <w:p>
@@ -7960,10 +6444,7 @@
         <w:spacing w:after="40"/>
       </w:pPr>
       <w:r>
-        <w:t>Kiểm chứng bằng đối chiếu lớp đường; trường hợp sai lệch, hiệu chỉnh tại gốc tham chiếu hoặc góc xoay tổng thể, không hiệu ch</w:t>
-      </w:r>
-      <w:r>
-        <w:t>ỉnh từng công trình.</w:t>
+        <w:t>Kiểm chứng bằng đối chiếu lớp đường; trường hợp sai lệch, hiệu chỉnh tại gốc tham chiếu hoặc góc xoay tổng thể, không hiệu chỉnh từng công trình.</w:t>
       </w:r>
     </w:p>
     <w:p>
@@ -8001,10 +6482,7 @@
         <w:t>Giám sát từ xa:</w:t>
       </w:r>
       <w:r>
-        <w:t xml:space="preserve"> trạng </w:t>
-      </w:r>
-      <w:r>
-        <w:t>thái tiêu thụ điện, mật độ phương tiện tại các cổng được phản ánh trực tiếp trên mô hình bằng mã màu.</w:t>
+        <w:t xml:space="preserve"> trạng thái tiêu thụ điện, mật độ phương tiện tại các cổng được phản ánh trực tiếp trên mô hình bằng mã màu.</w:t>
       </w:r>
     </w:p>
     <w:p>
@@ -8057,10 +6535,7 @@
         <w:spacing w:after="40"/>
       </w:pPr>
       <w:r>
-        <w:t>Ở chiều</w:t>
-      </w:r>
-      <w:r>
-        <w:t xml:space="preserve"> ngược lại, kinh nghiệm quốc tế cho thấy các digital twin thiếu dữ liệu vận hành đều dừng ở vai trò trình diễn và không tạo giá trị bền vững.</w:t>
+        <w:t xml:space="preserve">Ở chiều ngược lại, kinh nghiệm quốc tế cho thấy các digital twin thiếu dữ liệu vận hành đều dừng ở vai trò trình diễn và không tạo giá trị bền vững.</w:t>
       </w:r>
     </w:p>
     <w:p>
@@ -8078,10 +6553,7 @@
         <w:spacing w:after="80"/>
       </w:pPr>
       <w:r>
-        <w:t>Luồng dữ liệu tuân theo kiến trúc chuẩn được các digital twin quốc tế sử dụ</w:t>
-      </w:r>
-      <w:r>
-        <w:t>ng:</w:t>
+        <w:t>Luồng dữ liệu tuân theo kiến trúc chuẩn được các digital twin quốc tế sử dụng:</w:t>
       </w:r>
     </w:p>
     <w:p>
@@ -8094,139 +6566,7 @@
         <w:rPr>
           <w:rFonts w:ascii="Consolas" w:eastAsia="Consolas" w:hAnsi="Consolas" w:cs="Consolas"/>
         </w:rPr>
-        <w:t>Thi</w:t>
-      </w:r>
-      <w:r>
-        <w:rPr>
-          <w:rFonts w:ascii="Consolas" w:eastAsia="Consolas" w:hAnsi="Consolas" w:cs="Consolas"/>
-        </w:rPr>
-        <w:t>ế</w:t>
-      </w:r>
-      <w:r>
-        <w:rPr>
-          <w:rFonts w:ascii="Consolas" w:eastAsia="Consolas" w:hAnsi="Consolas" w:cs="Consolas"/>
-        </w:rPr>
-        <w:t>t b</w:t>
-      </w:r>
-      <w:r>
-        <w:rPr>
-          <w:rFonts w:ascii="Consolas" w:eastAsia="Consolas" w:hAnsi="Consolas" w:cs="Consolas"/>
-        </w:rPr>
-        <w:t>ị</w:t>
-      </w:r>
-      <w:r>
-        <w:rPr>
-          <w:rFonts w:ascii="Consolas" w:eastAsia="Consolas" w:hAnsi="Consolas" w:cs="Consolas"/>
-        </w:rPr>
-        <w:t xml:space="preserve"> đo (đi</w:t>
-      </w:r>
-      <w:r>
-        <w:rPr>
-          <w:rFonts w:ascii="Consolas" w:eastAsia="Consolas" w:hAnsi="Consolas" w:cs="Consolas"/>
-        </w:rPr>
-        <w:t>ệ</w:t>
-      </w:r>
-      <w:r>
-        <w:rPr>
-          <w:rFonts w:ascii="Consolas" w:eastAsia="Consolas" w:hAnsi="Consolas" w:cs="Consolas"/>
-        </w:rPr>
-        <w:t>n, camera, c</w:t>
-      </w:r>
-      <w:r>
-        <w:rPr>
-          <w:rFonts w:ascii="Consolas" w:eastAsia="Consolas" w:hAnsi="Consolas" w:cs="Consolas"/>
-        </w:rPr>
-        <w:t>ả</w:t>
-      </w:r>
-      <w:r>
-        <w:rPr>
-          <w:rFonts w:ascii="Consolas" w:eastAsia="Consolas" w:hAnsi="Consolas" w:cs="Consolas"/>
-        </w:rPr>
-        <w:t>m bi</w:t>
-      </w:r>
-      <w:r>
-        <w:rPr>
-          <w:rFonts w:ascii="Consolas" w:eastAsia="Consolas" w:hAnsi="Consolas" w:cs="Consolas"/>
-        </w:rPr>
-        <w:t>ế</w:t>
-      </w:r>
-      <w:r>
-        <w:rPr>
-          <w:rFonts w:ascii="Consolas" w:eastAsia="Consolas" w:hAnsi="Consolas" w:cs="Consolas"/>
-        </w:rPr>
-        <w:t>n) → MQTT broker → backend lưu tr</w:t>
-      </w:r>
-      <w:r>
-        <w:rPr>
-          <w:rFonts w:ascii="Consolas" w:eastAsia="Consolas" w:hAnsi="Consolas" w:cs="Consolas"/>
-        </w:rPr>
-        <w:t>ữ</w:t>
-      </w:r>
-      <w:r>
-        <w:rPr>
-          <w:rFonts w:ascii="Consolas" w:eastAsia="Consolas" w:hAnsi="Consolas" w:cs="Consolas"/>
-        </w:rPr>
-        <w:t xml:space="preserve"> l</w:t>
-      </w:r>
-      <w:r>
-        <w:rPr>
-          <w:rFonts w:ascii="Consolas" w:eastAsia="Consolas" w:hAnsi="Consolas" w:cs="Consolas"/>
-        </w:rPr>
-        <w:t>ị</w:t>
-      </w:r>
-      <w:r>
-        <w:rPr>
-          <w:rFonts w:ascii="Consolas" w:eastAsia="Consolas" w:hAnsi="Consolas" w:cs="Consolas"/>
-        </w:rPr>
-        <w:t>ch s</w:t>
-      </w:r>
-      <w:r>
-        <w:rPr>
-          <w:rFonts w:ascii="Consolas" w:eastAsia="Consolas" w:hAnsi="Consolas" w:cs="Consolas"/>
-        </w:rPr>
-        <w:t>ử</w:t>
-      </w:r>
-      <w:r>
-        <w:rPr>
-          <w:rFonts w:ascii="Consolas" w:eastAsia="Consolas" w:hAnsi="Consolas" w:cs="Consolas"/>
-        </w:rPr>
-        <w:t xml:space="preserve"> → WebSocket → c</w:t>
-      </w:r>
-      <w:r>
-        <w:rPr>
-          <w:rFonts w:ascii="Consolas" w:eastAsia="Consolas" w:hAnsi="Consolas" w:cs="Consolas"/>
-        </w:rPr>
-        <w:t>ậ</w:t>
-      </w:r>
-      <w:r>
-        <w:rPr>
-          <w:rFonts w:ascii="Consolas" w:eastAsia="Consolas" w:hAnsi="Consolas" w:cs="Consolas"/>
-        </w:rPr>
-        <w:t>p nh</w:t>
-      </w:r>
-      <w:r>
-        <w:rPr>
-          <w:rFonts w:ascii="Consolas" w:eastAsia="Consolas" w:hAnsi="Consolas" w:cs="Consolas"/>
-        </w:rPr>
-        <w:t>ậ</w:t>
-      </w:r>
-      <w:r>
-        <w:rPr>
-          <w:rFonts w:ascii="Consolas" w:eastAsia="Consolas" w:hAnsi="Consolas" w:cs="Consolas"/>
-        </w:rPr>
-        <w:t>t tr</w:t>
-      </w:r>
-      <w:r>
-        <w:rPr>
-          <w:rFonts w:ascii="Consolas" w:eastAsia="Consolas" w:hAnsi="Consolas" w:cs="Consolas"/>
-        </w:rPr>
-        <w:t>ạ</w:t>
-      </w:r>
-      <w:r>
-        <w:rPr>
-          <w:rFonts w:ascii="Consolas" w:eastAsia="Consolas" w:hAnsi="Consolas" w:cs="Consolas"/>
-        </w:rPr>
-        <w:t>ng thái trên web</w:t>
+        <w:t xml:space="preserve">Thiết bị đo (điện, camera, cảm biến) → MQTT broker → backend lưu trữ lịch sử → WebSocket → cập nhật trạng thái trên web</w:t>
       </w:r>
     </w:p>
     <w:p>
@@ -8452,10 +6792,7 @@
               <w:spacing w:before="20" w:after="20"/>
             </w:pPr>
             <w:r>
-              <w:t>Điện năng từng tòa và lưu lượng phương tiện tại cổng — hai nguồn có tính khả thi và giá trị cao nh</w:t>
-            </w:r>
-            <w:r>
-              <w:t>ất</w:t>
+              <w:t>Điện năng từng tòa và lưu lượng phương tiện tại cổng — hai nguồn có tính khả thi và giá trị cao nhất</w:t>
             </w:r>
           </w:p>
         </w:tc>
@@ -8556,10 +6893,7 @@
       </w:pPr>
       <w:bookmarkStart w:id="29" w:name="_Toc235473785"/>
       <w:r>
-        <w:t xml:space="preserve">6. Dữ </w:t>
-      </w:r>
-      <w:r>
-        <w:t>liệu và điều kiện chuẩn bị — đồng bộ và hiển thị trạng thái công trình</w:t>
+        <w:t xml:space="preserve">6. Dữ liệu và điều kiện chuẩn bị — đồng bộ và hiển thị trạng thái công trình</w:t>
       </w:r>
       <w:bookmarkEnd w:id="29"/>
     </w:p>
@@ -8578,10 +6912,7 @@
         <w:t>mã định danh công trình trong tệp 3D và trong hệ thống dữ liệu phải thống nhất</w:t>
       </w:r>
       <w:r>
-        <w:t xml:space="preserve"> — đây là khóa liên</w:t>
-      </w:r>
-      <w:r>
-        <w:t xml:space="preserve"> kết giữa mô hình và dữ liệu.</w:t>
+        <w:t xml:space="preserve"> — đây là khóa liên kết giữa mô hình và dữ liệu. Nguyên tắc này đã được chứng minh trong dự án: tòa TecnoPark và mạng đường ống ngầm có mô hình sinh trực tiếp từ tệp IFC gốc (bake chỉ số phần tử theo vertex, đối chiếu cơ sở dữ liệu SQLite trích từ IFC) và đã bấm chọn xem thông tin theo từng phần tử ngay trên dashboard — đây là mẫu tham chiếu khi mở rộng sang các công trình khác.</w:t>
       </w:r>
     </w:p>
     <w:tbl>
@@ -8901,7 +7232,7 @@
               <w:spacing w:before="20" w:after="20"/>
             </w:pPr>
             <w:r>
-              <w:t>Điều chỉnh một lần trong script hiện có</w:t>
+              <w:t xml:space="preserve">Điều chỉnh một lần trong script hiện có; tòa TecnoPark đã dùng quy ước chi tiết hơn (chỉ số phần tử IFC bake theo vertex, ánh xạ qua JSON) — dùng làm mẫu khi công trình khác có sẵn dữ liệu BIM/IFC gốc</w:t>
             </w:r>
           </w:p>
         </w:tc>
@@ -9058,10 +7389,7 @@
               <w:spacing w:before="20" w:after="20"/>
             </w:pPr>
             <w:r>
-              <w:t>Mosquitto; cấu trúc topic</w:t>
-            </w:r>
-            <w:r>
-              <w:t xml:space="preserve"> thống nhất dạng </w:t>
+              <w:t xml:space="preserve">Mosquitto; cấu trúc topic thống nhất dạng </w:t>
             </w:r>
             <w:r>
               <w:rPr>
@@ -9332,10 +7660,7 @@
               <w:spacing w:before="20" w:after="20"/>
             </w:pPr>
             <w:r>
-              <w:t xml:space="preserve">WebSocket/SSE cho dashboard; hệ thống </w:t>
-            </w:r>
-            <w:r>
-              <w:t>tài khoản do dữ liệu thuộc phạm vi nội bộ</w:t>
+              <w:t xml:space="preserve">WebSocket/SSE cho dashboard; hệ thống tài khoản do dữ liệu thuộc phạm vi nội bộ</w:t>
             </w:r>
           </w:p>
         </w:tc>
@@ -9405,10 +7730,7 @@
         <w:t>đồ họa tích hợp Intel Iris Xe 64EU (không có GPU rời)</w:t>
       </w:r>
       <w:r>
-        <w:t>, RAM 16 GB, SSD 512 GB. CPU 10 nhân là lợi thế cho các tác vụ nén tài nguyên, bake và vận hành máy</w:t>
-      </w:r>
-      <w:r>
-        <w:t xml:space="preserve"> chủ cục bộ; hạn chế về đồ họa khiến chiến lược </w:t>
+        <w:t xml:space="preserve">, RAM 16 GB, SSD 512 GB. CPU 10 nhân là lợi thế cho các tác vụ nén tài nguyên, bake và vận hành máy chủ cục bộ; hạn chế về đồ họa khiến chiến lược </w:t>
       </w:r>
       <w:r>
         <w:rPr>
@@ -9941,10 +8263,10 @@
                 <w:b/>
                 <w:bCs/>
               </w:rPr>
-              <w:t>ECharts</w:t>
-            </w:r>
-            <w:r>
-              <w:t xml:space="preserve"> (hoặc Chart.js)</w:t>
+              <w:t>Chart.js</w:t>
+            </w:r>
+            <w:r>
+              <w:t xml:space="preserve"> (đã dùng trong smartcity-chart-registry.js / stadium-chart-registry.js — kế thừa, không đổi thư viện)</w:t>
             </w:r>
           </w:p>
         </w:tc>
@@ -10028,10 +8350,7 @@
               <w:spacing w:before="20" w:after="20"/>
             </w:pPr>
             <w:r>
-              <w:t>Đều yêu cầu GPU rời/RTX; nhu cầu showcase Unreal (nếu có) nên thực hiện trên hạ</w:t>
-            </w:r>
-            <w:r>
-              <w:t xml:space="preserve"> tầng cloud GPU hoặc máy trạm chuyên dụng</w:t>
+              <w:t xml:space="preserve">Đều yêu cầu GPU rời/RTX; nhu cầu showcase Unreal (nếu có) nên thực hiện trên hạ tầng cloud GPU hoặc máy trạm chuyên dụng</w:t>
             </w:r>
           </w:p>
         </w:tc>
@@ -10048,10 +8367,7 @@
       </w:pPr>
       <w:r>
         <w:lastRenderedPageBreak/>
-        <w:t>Khuyến nghị bổ sung cho cấu hình 16 GB RAM: hạn chế ứng dụng chạy nền khi bake trong Blender; lưu tài nguyên gốc (texture độ phân giải cao, tệp .blend) trên lưu trữ ngoài, thiết bị chỉ giữ phiên bản nén; kiểm tra</w:t>
-      </w:r>
-      <w:r>
-        <w:t xml:space="preserve"> cấu hình RAM dual-channel do ảnh hưởng trực tiếp đến hiệu năng đồ họa tích hợp.</w:t>
+        <w:t xml:space="preserve">Khuyến nghị bổ sung cho cấu hình 16 GB RAM: hạn chế ứng dụng chạy nền khi bake trong Blender; lưu tài nguyên gốc (texture độ phân giải cao, tệp .blend) trên lưu trữ ngoài, thiết bị chỉ giữ phiên bản nén; kiểm tra cấu hình RAM dual-channel do ảnh hưởng trực tiếp đến hiệu năng đồ họa tích hợp.</w:t>
       </w:r>
     </w:p>
     <w:p>
@@ -10075,12 +8391,6 @@
           <w:bCs/>
         </w:rPr>
         <w:t>1.</w:t>
-      </w:r>
-      <w:r>
-        <w:rPr>
-          <w:b/>
-          <w:bCs/>
-        </w:rPr>
         <w:tab/>
       </w:r>
       <w:r>
@@ -10098,12 +8408,6 @@
           <w:bCs/>
         </w:rPr>
         <w:t>2.</w:t>
-      </w:r>
-      <w:r>
-        <w:rPr>
-          <w:b/>
-          <w:bCs/>
-        </w:rPr>
         <w:tab/>
       </w:r>
       <w:r>
@@ -10121,12 +8425,6 @@
           <w:bCs/>
         </w:rPr>
         <w:t>3.</w:t>
-      </w:r>
-      <w:r>
-        <w:rPr>
-          <w:b/>
-          <w:bCs/>
-        </w:rPr>
         <w:tab/>
       </w:r>
       <w:r>
@@ -10144,19 +8442,10 @@
           <w:bCs/>
         </w:rPr>
         <w:t>4.</w:t>
-      </w:r>
-      <w:r>
-        <w:rPr>
-          <w:b/>
-          <w:bCs/>
-        </w:rPr>
         <w:tab/>
       </w:r>
       <w:r>
-        <w:t>Dựng thử nghiệm MapLibre làm lớp nền dưới scene three.js;</w:t>
-      </w:r>
-      <w:r>
-        <w:t xml:space="preserve"> neo mô hình theo mốc và kiểm chứng độ khớp lớp đường.</w:t>
+        <w:t xml:space="preserve">Dựng thử nghiệm MapLibre làm lớp nền dưới scene three.js; neo mô hình theo mốc và kiểm chứng độ khớp lớp đường.</w:t>
       </w:r>
     </w:p>
     <w:p>
@@ -10170,16 +8459,10 @@
           <w:bCs/>
         </w:rPr>
         <w:t>5.</w:t>
-      </w:r>
-      <w:r>
-        <w:rPr>
-          <w:b/>
-          <w:bCs/>
-        </w:rPr>
         <w:tab/>
       </w:r>
       <w:r>
-        <w:t>Phát triển tính năng truy vấn thông tin công trình (chọn đối tượng — hiển thị panel) trên dashboard IOC.</w:t>
+        <w:t>Mở rộng tính năng truy vấn thông tin công trình (chọn đối tượng — hiển thị panel) sang các công trình còn lại trên dashboard IOC — cơ chế này đã chạy thật cho tòa TecnoPark và mạng đường ống ngầm (bake chỉ số phần tử IFC theo vertex, đối chiếu cơ sở dữ liệu SQLite trích từ IFC gốc).</w:t>
       </w:r>
     </w:p>
     <w:p>
@@ -10193,12 +8476,6 @@
           <w:bCs/>
         </w:rPr>
         <w:t>6.</w:t>
-      </w:r>
-      <w:r>
-        <w:rPr>
-          <w:b/>
-          <w:bCs/>
-        </w:rPr>
         <w:tab/>
       </w:r>
       <w:r>
@@ -10232,10 +8509,7 @@
         <w:t>Giới hạn phạm vi ở cấp khu đô thị</w:t>
       </w:r>
       <w:r>
-        <w:t xml:space="preserve"> (bài học Punggol): các dự án twin triển khai trên phạm vi quá rộng ngay từ </w:t>
-      </w:r>
-      <w:r>
-        <w:t>đầu thường không đạt vai trò công cụ hỗ trợ quyết định.</w:t>
+        <w:t xml:space="preserve"> (bài học Punggol): các dự án twin triển khai trên phạm vi quá rộng ngay từ đầu thường không đạt vai trò công cụ hỗ trợ quyết định.</w:t>
       </w:r>
     </w:p>
     <w:p>
@@ -10275,10 +8549,7 @@
         <w:t>Kiểm soát phạm vi tối ưu hình ảnh:</w:t>
       </w:r>
       <w:r>
-        <w:t xml:space="preserve"> khi</w:t>
-      </w:r>
-      <w:r>
-        <w:t xml:space="preserve"> đạt các chỉ tiêu tại mục 2.4, chuyển sang hạng mục tiếp theo thay vì tiếp tục tinh chỉnh đồ họa.</w:t>
+        <w:t xml:space="preserve"> khi đạt các chỉ tiêu tại mục 2.4, chuyển sang hạng mục tiếp theo thay vì tiếp tục tinh chỉnh đồ họa.</w:t>
       </w:r>
     </w:p>
     <w:p>
@@ -10442,10 +8713,7 @@
       <w:bookmarkStart w:id="34" w:name="_Toc235473790"/>
       <w:r>
         <w:lastRenderedPageBreak/>
-        <w:t xml:space="preserve">Áp dụng cho SVĐ Trống Đồng và </w:t>
-      </w:r>
-      <w:r>
-        <w:t>PVF</w:t>
+        <w:t xml:space="preserve">Áp dụng cho SVĐ Trống Đồng và PVF</w:t>
       </w:r>
       <w:bookmarkEnd w:id="34"/>
     </w:p>
@@ -10464,10 +8732,7 @@
         <w:t>theo cùng trình tự với Chương 5</w:t>
       </w:r>
       <w:r>
-        <w:t>: hoàn thiện mô hình web chất lượng cao – dung lượng thấp và định vị trên bản đồ trước, tích hợp dữ liệu ở giai đoạn sau. Chương này chỉ trình bày các nội dung đặc thù của sân vận động; ph</w:t>
-      </w:r>
-      <w:r>
-        <w:t>ương pháp chung tham chiếu Chương 5.</w:t>
+        <w:t>: hoàn thiện mô hình web chất lượng cao – dung lượng thấp và định vị trên bản đồ trước, tích hợp dữ liệu ở giai đoạn sau. Chương này chỉ trình bày các nội dung đặc thù của sân vận động; phương pháp chung tham chiếu Chương 5.</w:t>
       </w:r>
     </w:p>
     <w:p>
@@ -10502,14 +8767,7 @@
           <w:b/>
           <w:bCs/>
         </w:rPr>
-        <w:t>Khán đài là trường hợp áp dụng instancing điể</w:t>
-      </w:r>
-      <w:r>
-        <w:rPr>
-          <w:b/>
-          <w:bCs/>
-        </w:rPr>
-        <w:t>n hình:</w:t>
+        <w:t>Khán đài là trường hợp áp dụng instancing điển hình:</w:t>
       </w:r>
       <w:r>
         <w:t xml:space="preserve"> một mẫu ghế duy nhất được nhân bản cho hàng vạn vị trí — GPU thực hiện một lệnh vẽ, dung lượng mô hình không đáng kể. Việc phân màu ghế theo khu vực khán đài nên thực hiện ngay từ bước này, làm cơ sở cho sơ đồ chỗ ngồi/vé về sau.</w:t>
@@ -10529,14 +8787,7 @@
           <w:b/>
           <w:bCs/>
         </w:rPr>
-        <w:t>Tập trung chi tiết</w:t>
-      </w:r>
-      <w:r>
-        <w:rPr>
-          <w:b/>
-          <w:bCs/>
-        </w:rPr>
-        <w:t xml:space="preserve"> vào mái và kết cấu biểu tượng:</w:t>
+        <w:t xml:space="preserve">Tập trung chi tiết vào mái và kết cấu biểu tượng:</w:t>
       </w:r>
       <w:r>
         <w:t xml:space="preserve"> đây là thành phần nhận diện của công trình trong mọi góc quan sát, xứng đáng được phân bổ ngân sách poly; các khu vực chức năng bên trong (phòng kỹ thuật, khu VIP, phòng thay đồ) sử dụng khối đơn giản kèm mã định danh.</w:t>
@@ -10556,14 +8807,7 @@
           <w:b/>
           <w:bCs/>
         </w:rPr>
-        <w:t xml:space="preserve">Định </w:t>
-      </w:r>
-      <w:r>
-        <w:rPr>
-          <w:b/>
-          <w:bCs/>
-        </w:rPr>
-        <w:t>vị chung hệ tọa độ với Ocean Park:</w:t>
+        <w:t xml:space="preserve">Định vị chung hệ tọa độ với Ocean Park:</w:t>
       </w:r>
       <w:r>
         <w:t xml:space="preserve"> hai sân được neo tọa độ theo phương pháp mục 3 Chương 5, cho phép hiển thị khu đô thị và hai sân vận động trên cùng một bản đồ, camera di chuyển liên tục giữa các khu vực.</w:t>
@@ -10574,10 +8818,7 @@
         <w:spacing w:after="80"/>
       </w:pPr>
       <w:r>
-        <w:t>Sản phẩm của riêng giai đoạn này đã có giá trị sử</w:t>
-      </w:r>
-      <w:r>
-        <w:t xml:space="preserve"> dụng độc lập: </w:t>
+        <w:t xml:space="preserve">Sản phẩm của riêng giai đoạn này đã có giá trị sử dụng độc lập: </w:t>
       </w:r>
       <w:r>
         <w:rPr>
@@ -10587,10 +8828,7 @@
         <w:t>tour tham quan 3D trên web</w:t>
       </w:r>
       <w:r>
-        <w:t xml:space="preserve"> phục vụ giới thiệu sân cho đối tác thuê tổ chức sự kiện (Trống Đồng) và cho phụ huynh, học viên ở xa tham quan học viện từ thiết bị di động (PVF) — mô hình thương mại Real Madrid đang khai thác tại Bernabéu, điều c</w:t>
-      </w:r>
-      <w:r>
-        <w:t>hỉnh về quy mô phù hợp.</w:t>
+        <w:t xml:space="preserve"> phục vụ giới thiệu sân cho đối tác thuê tổ chức sự kiện (Trống Đồng) và cho phụ huynh, học viên ở xa tham quan học viện từ thiết bị di động (PVF) — mô hình thương mại Real Madrid đang khai thác tại Bernabéu, điều chỉnh về quy mô phù hợp.</w:t>
       </w:r>
     </w:p>
     <w:p>
@@ -10858,10 +9096,7 @@
               <w:spacing w:before="20" w:after="20"/>
             </w:pPr>
             <w:r>
-              <w:t>SoFi ghi nhận giảm thời gian ch</w:t>
-            </w:r>
-            <w:r>
-              <w:t>ờ tại quầy dịch vụ và hỗ trợ định hướng cho nhân sự thời vụ; xu hướng FIFA 2026: mô phỏng sơ tán cho các sân đăng cai</w:t>
+              <w:t>SoFi ghi nhận giảm thời gian chờ tại quầy dịch vụ và hỗ trợ định hướng cho nhân sự thời vụ; xu hướng FIFA 2026: mô phỏng sơ tán cho các sân đăng cai</w:t>
             </w:r>
           </w:p>
         </w:tc>
@@ -10898,10 +9133,7 @@
         <w:t>sân tập số</w:t>
       </w:r>
       <w:r>
-        <w:t xml:space="preserve"> — dữ liệu GPS của cầu thủ trong buổi tập (thiết bị</w:t>
-      </w:r>
-      <w:r>
-        <w:t xml:space="preserve"> áo GPS phổ biến tại các học viện lớn) được chiếu lên mô hình sân 3D, cho phép ban huấn luyện phân tích lại buổi tập một cách định lượng: quãng đường di chuyển, phạm vi hoạt động, tốc độ của từng cầu thủ và diễn biến qua các tuần.</w:t>
+        <w:t xml:space="preserve"> — dữ liệu GPS của cầu thủ trong buổi tập (thiết bị áo GPS phổ biến tại các học viện lớn) được chiếu lên mô hình sân 3D, cho phép ban huấn luyện phân tích lại buổi tập một cách định lượng: quãng đường di chuyển, phạm vi hoạt động, tốc độ của từng cầu thủ và diễn biến qua các tuần.</w:t>
       </w:r>
     </w:p>
     <w:p>
@@ -10910,10 +9142,7 @@
       </w:pPr>
       <w:bookmarkStart w:id="37" w:name="_Toc235473793"/>
       <w:r>
-        <w:t>3. Dữ liệu và điều kiện c</w:t>
-      </w:r>
-      <w:r>
-        <w:t>huẩn bị cho hai sân</w:t>
+        <w:t>3. Dữ liệu và điều kiện chuẩn bị cho hai sân</w:t>
       </w:r>
       <w:bookmarkEnd w:id="37"/>
     </w:p>
@@ -11279,10 +9508,7 @@
               <w:spacing w:before="20" w:after="20"/>
             </w:pPr>
             <w:r>
-              <w:t>Sơ đồ phân khu ghế và năng lực thông q</w:t>
-            </w:r>
-            <w:r>
-              <w:t>ua từng cổng</w:t>
+              <w:t>Sơ đồ phân khu ghế và năng lực thông qua từng cổng</w:t>
             </w:r>
           </w:p>
         </w:tc>
@@ -11674,10 +9900,7 @@
         <w:t>Nền tảng web trước, dữ liệu sau</w:t>
       </w:r>
       <w:r>
-        <w:t xml:space="preserve"> — song không dừng ở khâu hiển thị: giá</w:t>
-      </w:r>
-      <w:r>
-        <w:t xml:space="preserve"> trị dài hạn thuộc về bước 2–3 (bài học SoFi Stadium).</w:t>
+        <w:t xml:space="preserve"> — song không dừng ở khâu hiển thị: giá trị dài hạn thuộc về bước 2–3 (bài học SoFi Stadium).</w:t>
       </w:r>
     </w:p>
     <w:p>
@@ -11714,14 +9937,7 @@
           <w:b/>
           <w:bCs/>
         </w:rPr>
-        <w:t>Các sản phẩm thương mại hóa trải nghiệm (tour ảo, s</w:t>
-      </w:r>
-      <w:r>
-        <w:rPr>
-          <w:b/>
-          <w:bCs/>
-        </w:rPr>
-        <w:t>ự kiện tương tác) xây dựng trên nền vận hành đã ổn định</w:t>
+        <w:t>Các sản phẩm thương mại hóa trải nghiệm (tour ảo, sự kiện tương tác) xây dựng trên nền vận hành đã ổn định</w:t>
       </w:r>
       <w:r>
         <w:t xml:space="preserve"> — trình tự Bernabéu đã kiểm chứng; trình tự ngược lại tạo ra sản phẩm trình diễn không có người dùng thường xuyên.</w:t>
@@ -11742,10 +9958,7 @@
         <w:spacing w:after="80"/>
       </w:pPr>
       <w:r>
-        <w:t>Số liệu và chi tiết case study: xem Chương 3 (SoFi × Willow, Bernabéu</w:t>
-      </w:r>
-      <w:r>
-        <w:t>, FIFA 2026) và danh mục nguồn kèm theo.</w:t>
+        <w:t>Số liệu và chi tiết case study: xem Chương 3 (SoFi × Willow, Bernabéu, FIFA 2026) và danh mục nguồn kèm theo.</w:t>
       </w:r>
     </w:p>
     <w:sectPr>

</xml_diff>